<commit_message>
Actualizacion final de proyecto reducido.docx alineado a la consigna oficial
</commit_message>
<xml_diff>
--- a/proyecto prueba/proyecto reducido.docx
+++ b/proyecto prueba/proyecto reducido.docx
@@ -218,11 +218,19 @@
     <w:p/>
     <w:p>
       <w:r>
-        <w:t>La Jefatura debe desempeñar un rol integrador que trascienda la coordinación técnica. Su responsabilidad central consiste en combinar conocimientos técnicos con planificación, conducción de equipos y administración de recursos, generando condiciones para desarrollar software de manera previsible, colaborativa y sostenible, promoviendo la integración humana, la reutilización del conocimiento, la adopción responsable de nuevas tecnologías y la mejora continua de procedimientos, alineando decisiones tecnológicas a los objetivos institucionales y al régimen administrativo.</w:t>
-      </w:r>
-    </w:p>
-    <w:p/>
-    <w:p>
+        <w:t xml:space="preserve">La Jefatura debe desempeñar un rol integrador que trascienda la coordinación técnica. Su responsabilidad central consiste en combinar conocimientos técnicos con planificación, conducción de equipos y administración de recursos, generando condiciones para desarrollar software de manera previsible, colaborativa y sostenible. En este marco, promoverá la integración humana, la reutilización del conocimiento y la adopción responsable de nuevas tecnologías, consolidando la optimización de los procedimientos organizacionales como la columna vertebral que asegure que el código no solo funcione, sino que sea escalable, seguro y </w:t>
+      </w:r>
+      <w:r>
+        <w:lastRenderedPageBreak/>
+        <w:t>responda a las necesidades de las diferentes gestiones, presente y futura, alineando decisiones tecnológicas a los objetivos institucional</w:t>
+      </w:r>
+      <w:r>
+        <w:t>es y al régimen administrativo.</w:t>
+      </w:r>
+    </w:p>
+    <w:p>
+      <w:bookmarkStart w:id="0" w:name="_GoBack"/>
+      <w:bookmarkEnd w:id="0"/>
       <w:r>
         <w:t>El Departamento actúa en un entorno dinámico caracterizado por la coexistencia de sistemas de distinta antigüedad, múltiples requerimientos simultáneos, recursos limitados y demanda creciente de soluciones digitales. Frente a esta realidad, la respuesta no es limitarse a solicitar mayores recursos, sino fortalecer la organización del trabajo actual, establecer criterios comunes y consolidar una cultura de mejora continua.</w:t>
       </w:r>
@@ -342,7 +350,6 @@
           <w:b/>
           <w:bCs/>
         </w:rPr>
-        <w:lastRenderedPageBreak/>
         <w:t>2.2 Análisis FODA</w:t>
       </w:r>
     </w:p>
@@ -902,7 +909,7 @@
     </w:p>
     <w:p>
       <w:r>
-        <w:t>El crecimiento sostenido del Departamento hace necesario reducir la dependencia de prácticas individuales y avanzar hacia procedimientos institucionales homogéneos. Toda actividad recurrente deberá encontrarse respaldada por procedimientos claros que permitan garantizar continuidad, previsibilidad y calidad, simplificando el trabajo cotidiano y asegurando la continuidad operativa.</w:t>
+        <w:t>El crecimiento sostenido del Departamento exige que los procedimientos organizacionales constituyan la columna vertebral del área, asegurando que el código no solo funcione en la coyuntura, sino que sea técnicamente escalable, seguro frente a vulnerabilidades y sostenible a lo largo del tiempo. Toda actividad recurrente deberá respaldarse en estándares claros que garanticen previsibilidad y respuesta efectiva ante las demandas de la gestión presente y futura.</w:t>
       </w:r>
     </w:p>
     <w:p/>
@@ -1011,8 +1018,6 @@
         </w:rPr>
         <w:t>4. OBJETIVOS DEL PLAN DE TRABAJO</w:t>
       </w:r>
-      <w:bookmarkStart w:id="0" w:name="_GoBack"/>
-      <w:bookmarkEnd w:id="0"/>
     </w:p>
     <w:p>
       <w:r>
@@ -6427,24 +6432,13 @@
       </w:pPr>
     </w:p>
     <w:p>
-      <w:pPr>
-        <w:pStyle w:val="Ttulo1"/>
-        <w:rPr>
-          <w:sz w:val="22"/>
-          <w:szCs w:val="22"/>
-        </w:rPr>
-      </w:pPr>
-      <w:r>
-        <w:rPr>
-          <w:rFonts w:eastAsia="Times New Roman"/>
-          <w:color w:val="auto"/>
-          <w:sz w:val="22"/>
-          <w:szCs w:val="22"/>
-        </w:rPr>
-        <w:t>En este sentido, la propuesta busca consolidar un Departamento capaz de desarrollar soluciones informáticas seguras, sostenibles y de calidad, preservando el conocimiento institucional y generando valor para la Administración Municipal y la comunidad.</w:t>
-      </w:r>
-    </w:p>
-    <w:p/>
+      <w:r>
+        <w:rPr>
+          <w:rFonts w:eastAsia="Times New Roman"/>
+        </w:rPr>
+        <w:t>En este sentido, la propuesta presentada busca consolidar la optimización de los procedimientos organizacionales como la columna vertebral del Departamento, asegurando que el código no solo funcione, sino que sea escalable, seguro y responda de manera sostenida a las exigencias de las diferentes gestiones, presente y futura, preservando el conocimiento institucional y generando valor permanente para la Administración Municipal y la comunidad.</w:t>
+      </w:r>
+    </w:p>
     <w:sectPr>
       <w:pgSz w:w="11906" w:h="16838"/>
       <w:pgMar w:top="1701" w:right="850" w:bottom="850" w:left="1701" w:header="708" w:footer="708" w:gutter="0"/>

</xml_diff>

<commit_message>
Actualizacion de proyecto, descargo e informes de concursos y capacitaciones
</commit_message>
<xml_diff>
--- a/proyecto prueba/proyecto reducido.docx
+++ b/proyecto prueba/proyecto reducido.docx
@@ -229,8 +229,6 @@
       </w:r>
     </w:p>
     <w:p>
-      <w:bookmarkStart w:id="0" w:name="_GoBack"/>
-      <w:bookmarkEnd w:id="0"/>
       <w:r>
         <w:t>El Departamento actúa en un entorno dinámico caracterizado por la coexistencia de sistemas de distinta antigüedad, múltiples requerimientos simultáneos, recursos limitados y demanda creciente de soluciones digitales. Frente a esta realidad, la respuesta no es limitarse a solicitar mayores recursos, sino fortalecer la organización del trabajo actual, establecer criterios comunes y consolidar una cultura de mejora continua.</w:t>
       </w:r>
@@ -284,7 +282,7 @@
         <w:ind w:left="708"/>
       </w:pPr>
       <w:r>
-        <w:t xml:space="preserve"> ● Planificación estratégica orientada a resultados.</w:t>
+        <w:t>● Planificación estratégica orientada a resultados.</w:t>
       </w:r>
     </w:p>
     <w:p/>
@@ -373,7 +371,35 @@
           <w:b/>
           <w:bCs/>
         </w:rPr>
-        <w:t xml:space="preserve">• Capital humano con alto conocimiento del negocio municipal: </w:t>
+        <w:t xml:space="preserve">• Capital humano con alto conocimiento </w:t>
+      </w:r>
+      <w:r>
+        <w:rPr>
+          <w:b/>
+          <w:bCs/>
+        </w:rPr>
+        <w:t>de los servicios</w:t>
+      </w:r>
+      <w:r>
+        <w:rPr>
+          <w:b/>
+          <w:bCs/>
+        </w:rPr>
+        <w:t xml:space="preserve"> municipal</w:t>
+      </w:r>
+      <w:r>
+        <w:rPr>
+          <w:b/>
+          <w:bCs/>
+        </w:rPr>
+        <w:t>es</w:t>
+      </w:r>
+      <w:r>
+        <w:rPr>
+          <w:b/>
+          <w:bCs/>
+        </w:rPr>
+        <w:t xml:space="preserve">: </w:t>
       </w:r>
       <w:r>
         <w:t>El Departamento cuenta con agentes que poseen una valiosa experiencia en el funcionamiento de la Administración Pública Municipal, combinando conocimientos tecnológicos con una profunda comprensión de los procedimientos administrativos, la normativa vigente y las necesidades particulares de las distintas áreas usuarias. Este conocimiento constituye uno de los principales activos institucionales y representa una base sólida para impulsar procesos de mejora e innovación.</w:t>
@@ -522,7 +548,11 @@
         <w:t xml:space="preserve">• Concentración del conocimiento: </w:t>
       </w:r>
       <w:r>
-        <w:t>Una parte significativa del conocimiento funcional y técnico de determinados sistemas críticos se encuentra concentrada en un número reducido de agentes, lo que incrementa el riesgo operacional, dificulta la planificación de tareas, genera cuellos de botella y limita la flexibilidad del Departamento para reasignar recursos ante licencias del personal, imprevistos o prioridades institucionales.</w:t>
+        <w:t xml:space="preserve">Una parte significativa del conocimiento funcional y técnico de determinados sistemas críticos se encuentra concentrada en un número reducido de agentes, lo que incrementa el riesgo operacional, dificulta la planificación de tareas, genera cuellos de </w:t>
+      </w:r>
+      <w:r>
+        <w:lastRenderedPageBreak/>
+        <w:t>botella y limita la flexibilidad del Departamento para reasignar recursos ante licencias del personal, imprevistos o prioridades institucionales.</w:t>
       </w:r>
     </w:p>
     <w:p>
@@ -531,7 +561,6 @@
           <w:b/>
           <w:bCs/>
         </w:rPr>
-        <w:lastRenderedPageBreak/>
         <w:t xml:space="preserve">• Ausencia de procedimientos homogéneos: </w:t>
       </w:r>
       <w:r>
@@ -547,35 +576,141 @@
         <w:t xml:space="preserve">• Resistencia a la adopción de tecnologías modernas: </w:t>
       </w:r>
       <w:r>
-        <w:t xml:space="preserve">Una parte del equipo, particularmente agentes con experiencia en plataformas como </w:t>
+        <w:t xml:space="preserve">Una parte del equipo, particularmente agentes con experiencia en plataformas </w:t>
       </w:r>
       <w:proofErr w:type="spellStart"/>
       <w:r>
-        <w:t>WebForms</w:t>
+        <w:t>legacy</w:t>
       </w:r>
       <w:proofErr w:type="spellEnd"/>
       <w:r>
-        <w:t xml:space="preserve">, muestra resistencia a adoptar alternativas más modernas como .NET, </w:t>
+        <w:t xml:space="preserve"> (antiguas)</w:t>
+      </w:r>
+      <w:r>
+        <w:t>, muestra resistencia a adoptar alternativas más modernas, lo que limita la capacidad del Departamento para modernizar sus aplicaciones y dificulta la distribución de tareas en proyectos que requieren tecnologías actualizadas.</w:t>
+      </w:r>
+    </w:p>
+    <w:p>
+      <w:r>
+        <w:rPr>
+          <w:b/>
+          <w:bCs/>
+        </w:rPr>
+        <w:t xml:space="preserve">• Gestión fragmentada de proyectos: </w:t>
+      </w:r>
+      <w:r>
+        <w:t>El seguimiento de proyectos se realiza utilizando diferentes herramientas y metodologías, lo que dificulta obtener una visión integral de la carga de trabajo del Departamento, impide conocer su capacidad operativa real, dificulta la priorización transparente de solicitudes entre Secretarías y genera desajustes en las estimaciones de tiempos de entrega.</w:t>
+      </w:r>
+    </w:p>
+    <w:p>
+      <w:r>
+        <w:rPr>
+          <w:b/>
+          <w:bCs/>
+        </w:rPr>
+        <w:t xml:space="preserve">• Comunicación y coordinación entre equipos: </w:t>
+      </w:r>
+      <w:r>
+        <w:t>La distribución física del personal en distintas dependencias limita la circulación oportuna de información, favoreciendo el aislamiento en silos informáticos, incrementando el riesgo de desarrollar soluciones o módulos duplicados y resintiendo la cohesión y sentido de pertenencia a un equipo único.</w:t>
+      </w:r>
+    </w:p>
+    <w:p>
+      <w:r>
+        <w:rPr>
+          <w:b/>
+          <w:bCs/>
+        </w:rPr>
+        <w:t xml:space="preserve">• Dependencia del mantenimiento reactivo: </w:t>
+      </w:r>
+      <w:r>
+        <w:t>La atención permanente de incidencias y requerimientos urgentes reduce el tiempo disponible para actividades de planificación y mejora continua, consumiendo la capacidad técnica en emergencias cotidianas e impidiendo dedicar tiempo a la documentación, la deuda técnica y la modernización planificada de sistemas.</w:t>
+      </w:r>
+    </w:p>
+    <w:p>
+      <w:r>
+        <w:rPr>
+          <w:b/>
+          <w:bCs/>
+        </w:rPr>
+        <w:t xml:space="preserve">• Gestión del conocimiento insuficiente: </w:t>
+      </w:r>
+      <w:r>
+        <w:t>La documentación técnica, funcional y de arquitectura presenta distintos niveles de desarrollo según el proyecto, lo que aumenta la dependencia del conocimiento tácito individual, encarece la curva de aprendizaje y pone en riesgo la continuidad de los aplicativos frente a licencias, traslados o bajas de personal.</w:t>
+      </w:r>
+    </w:p>
+    <w:p>
+      <w:r>
+        <w:t xml:space="preserve">• </w:t>
+      </w:r>
+      <w:r>
+        <w:rPr>
+          <w:b/>
+        </w:rPr>
+        <w:t>Limitaciones en la especialización funcional</w:t>
+      </w:r>
+      <w:r>
+        <w:t>: La dotación actual del Departamento requiere que los agentes desempeñen simultáneamente tareas de análisis, desarrollo, mantenimiento y soporte funcional, independientemente de la especialización prevista por el agrupamiento ocupacional, reduciendo la posibilidad de conformar equipos con roles claramente diferenciados.</w:t>
+      </w:r>
+    </w:p>
+    <w:p/>
+    <w:p>
+      <w:pPr>
+        <w:pStyle w:val="Ttulo3"/>
+      </w:pPr>
+      <w:r>
+        <w:rPr>
+          <w:b/>
+          <w:bCs/>
+        </w:rPr>
+        <w:t>Amenazas</w:t>
+      </w:r>
+    </w:p>
+    <w:p>
+      <w:r>
+        <w:rPr>
+          <w:b/>
+          <w:bCs/>
+        </w:rPr>
+        <w:t xml:space="preserve">• Incremento sostenido de la demanda e indefinición de áreas usuarias: </w:t>
+      </w:r>
+      <w:r>
+        <w:t>La demanda creciente sumada a dilaciones o falta de certeza por parte de las dependencias solicitantes al definir circuitos administrativos puede superar la capacidad operativa si no se formaliza un circuito único de demandas.</w:t>
+      </w:r>
+    </w:p>
+    <w:p>
+      <w:r>
+        <w:rPr>
+          <w:b/>
+          <w:bCs/>
+        </w:rPr>
+        <w:t xml:space="preserve">• Obsolescencia e integración con sistemas </w:t>
       </w:r>
       <w:proofErr w:type="spellStart"/>
       <w:r>
-        <w:t>React</w:t>
+        <w:rPr>
+          <w:b/>
+          <w:bCs/>
+        </w:rPr>
+        <w:t>legacy</w:t>
       </w:r>
       <w:proofErr w:type="spellEnd"/>
       <w:r>
-        <w:t xml:space="preserve"> o Angular, lo que limita la capacidad del Departamento para modernizar sus aplicaciones y dificulta la distribución de tareas en proyectos que requieren tecnologías actualizadas.</w:t>
-      </w:r>
-    </w:p>
-    <w:p>
-      <w:r>
         <w:rPr>
           <w:b/>
           <w:bCs/>
         </w:rPr>
-        <w:t xml:space="preserve">• Gestión fragmentada de proyectos: </w:t>
-      </w:r>
-      <w:r>
-        <w:t>El seguimiento de proyectos se realiza utilizando diferentes herramientas y metodologías, lo que dificulta obtener una visión integral de la carga de trabajo del Departamento, impide conocer su capacidad operativa real, dificulta la priorización transparente de solicitudes entre Secretarías y genera desajustes en las estimaciones de tiempos de entrega.</w:t>
+        <w:t xml:space="preserve">: </w:t>
+      </w:r>
+      <w:r>
+        <w:t xml:space="preserve">La coexistencia de aplicaciones sobre tecnologías antiguas que carecen de </w:t>
+      </w:r>
+      <w:proofErr w:type="spellStart"/>
+      <w:r>
+        <w:t>APIs</w:t>
+      </w:r>
+      <w:proofErr w:type="spellEnd"/>
+      <w:r>
+        <w:t xml:space="preserve"> unificadas incrementa el riesgo operativo y dificulta su integración con nuevos desarrollos web o móviles.</w:t>
       </w:r>
     </w:p>
     <w:p>
@@ -584,121 +719,24 @@
           <w:b/>
           <w:bCs/>
         </w:rPr>
-        <w:t xml:space="preserve">• Comunicación y coordinación entre equipos: </w:t>
-      </w:r>
-      <w:r>
-        <w:t>La distribución física del personal en distintas dependencias limita la circulación oportuna de información, favoreciendo el aislamiento en silos informáticos, incrementando el riesgo de desarrollar soluciones o módulos duplicados y resintiendo la cohesión y sentido de pertenencia a un equipo único.</w:t>
-      </w:r>
-    </w:p>
-    <w:p>
-      <w:r>
-        <w:rPr>
-          <w:b/>
-          <w:bCs/>
-        </w:rPr>
-        <w:t xml:space="preserve">• Dependencia del mantenimiento reactivo: </w:t>
-      </w:r>
-      <w:r>
-        <w:t>La atención permanente de incidencias y requerimientos urgentes reduce el tiempo disponible para actividades de planificación y mejora continua, consumiendo la capacidad técnica en emergencias cotidianas e impidiendo dedicar tiempo a la documentación, la deuda técnica y la modernización planificada de sistemas.</w:t>
-      </w:r>
-    </w:p>
-    <w:p>
-      <w:r>
-        <w:rPr>
-          <w:b/>
-          <w:bCs/>
-        </w:rPr>
-        <w:t xml:space="preserve">• Gestión del conocimiento insuficiente: </w:t>
-      </w:r>
-      <w:r>
-        <w:t>La documentación técnica, funcional y de arquitectura presenta distintos niveles de desarrollo según el proyecto, lo que aumenta la dependencia del conocimiento tácito individual, encarece la curva de aprendizaje y pone en riesgo la continuidad de los aplicativos frente a licencias, traslados o bajas de personal.</w:t>
-      </w:r>
-    </w:p>
-    <w:p>
-      <w:r>
-        <w:t xml:space="preserve">• </w:t>
-      </w:r>
-      <w:r>
-        <w:rPr>
-          <w:b/>
-        </w:rPr>
-        <w:t>Limitaciones en la especialización funcional</w:t>
-      </w:r>
-      <w:r>
-        <w:t>: La dotación actual del Departamento requiere que los agentes desempeñen simultáneamente tareas de análisis, desarrollo, mantenimiento y soporte funcional, independientemente de la especialización prevista por el agrupamiento ocupacional, reduciendo la posibilidad de conformar equipos con roles claramente diferenciados.</w:t>
-      </w:r>
-    </w:p>
-    <w:p/>
-    <w:p>
-      <w:pPr>
-        <w:pStyle w:val="Ttulo3"/>
-      </w:pPr>
-      <w:r>
-        <w:rPr>
-          <w:b/>
-          <w:bCs/>
-        </w:rPr>
-        <w:t>Amenazas</w:t>
-      </w:r>
-    </w:p>
-    <w:p>
-      <w:r>
-        <w:rPr>
-          <w:b/>
-          <w:bCs/>
-        </w:rPr>
-        <w:t xml:space="preserve">• Incremento sostenido de la demanda e indefinición de áreas usuarias: </w:t>
-      </w:r>
-      <w:r>
-        <w:t>La demanda creciente sumada a dilaciones o falta de certeza por parte de las dependencias solicitantes al definir circuitos administrativos puede superar la capacidad operativa si no se formaliza un circuito único de demandas.</w:t>
-      </w:r>
-    </w:p>
-    <w:p>
-      <w:r>
-        <w:rPr>
-          <w:b/>
-          <w:bCs/>
-        </w:rPr>
-        <w:t xml:space="preserve">• Obsolescencia e integración con sistemas </w:t>
-      </w:r>
-      <w:proofErr w:type="spellStart"/>
-      <w:r>
-        <w:rPr>
-          <w:b/>
-          <w:bCs/>
-        </w:rPr>
-        <w:t>legacy</w:t>
-      </w:r>
-      <w:proofErr w:type="spellEnd"/>
-      <w:r>
-        <w:rPr>
-          <w:b/>
-          <w:bCs/>
-        </w:rPr>
-        <w:t xml:space="preserve">: </w:t>
-      </w:r>
-      <w:r>
-        <w:t xml:space="preserve">La coexistencia de aplicaciones sobre tecnologías antiguas que carecen de </w:t>
-      </w:r>
-      <w:proofErr w:type="spellStart"/>
-      <w:r>
-        <w:t>APIs</w:t>
-      </w:r>
-      <w:proofErr w:type="spellEnd"/>
-      <w:r>
-        <w:t xml:space="preserve"> unificadas incrementa el riesgo operativo y dificulta su integración con nuevos desarrollos web o móviles.</w:t>
-      </w:r>
-    </w:p>
-    <w:p>
-      <w:r>
-        <w:rPr>
-          <w:b/>
-          <w:bCs/>
-        </w:rPr>
         <w:t xml:space="preserve">• Riesgo de dependencia técnica sobre proveedores externos: </w:t>
       </w:r>
       <w:r>
-        <w:t>La entrega de soluciones por terceros sin un canal fluido de comunicación técnica ni una contraparte municipal que participe activamente del seguimiento puede generar dependencia total del proveedor y pérdida del conocimiento institucional, derivando en mayores costos de mantenimiento e imposibilitando el desarrollo soberano ante una terminación temprana de la contratación.</w:t>
+        <w:t xml:space="preserve">La entrega de soluciones por terceros sin un canal fluido de comunicación técnica ni una contraparte municipal que participe activamente del seguimiento puede generar </w:t>
+      </w:r>
+      <w:r>
+        <w:t xml:space="preserve">dependencia total del proveedor, </w:t>
+      </w:r>
+      <w:r>
+        <w:t>pérdida del conocimiento institucional</w:t>
+      </w:r>
+      <w:r>
+        <w:t xml:space="preserve"> y soberanía</w:t>
+      </w:r>
+      <w:bookmarkStart w:id="0" w:name="_GoBack"/>
+      <w:bookmarkEnd w:id="0"/>
+      <w:r>
+        <w:t>, derivando en mayores costos de mantenimiento e imposibilitando el desarrollo soberano ante una terminación temprana de la contratación.</w:t>
       </w:r>
     </w:p>
     <w:p>
@@ -1007,12 +1045,14 @@
       <w:pPr>
         <w:pStyle w:val="Ttulo1"/>
         <w:rPr>
+          <w:b/>
           <w:sz w:val="28"/>
           <w:szCs w:val="28"/>
         </w:rPr>
       </w:pPr>
       <w:r>
         <w:rPr>
+          <w:b/>
           <w:sz w:val="28"/>
           <w:szCs w:val="28"/>
         </w:rPr>
@@ -1102,12 +1142,14 @@
       <w:pPr>
         <w:pStyle w:val="Ttulo1"/>
         <w:rPr>
+          <w:b/>
           <w:sz w:val="28"/>
           <w:szCs w:val="28"/>
         </w:rPr>
       </w:pPr>
       <w:r>
         <w:rPr>
+          <w:b/>
           <w:sz w:val="28"/>
           <w:szCs w:val="28"/>
         </w:rPr>
@@ -1191,12 +1233,14 @@
       <w:pPr>
         <w:pStyle w:val="Ttulo1"/>
         <w:rPr>
-          <w:sz w:val="24"/>
-          <w:szCs w:val="24"/>
-        </w:rPr>
-      </w:pPr>
-      <w:r>
-        <w:rPr>
+          <w:b/>
+          <w:sz w:val="24"/>
+          <w:szCs w:val="24"/>
+        </w:rPr>
+      </w:pPr>
+      <w:r>
+        <w:rPr>
+          <w:b/>
           <w:sz w:val="24"/>
           <w:szCs w:val="24"/>
         </w:rPr>
@@ -1204,6 +1248,7 @@
       </w:r>
       <w:r>
         <w:rPr>
+          <w:b/>
           <w:sz w:val="26"/>
           <w:szCs w:val="26"/>
         </w:rPr>
@@ -1211,6 +1256,7 @@
       </w:r>
       <w:r>
         <w:rPr>
+          <w:b/>
           <w:sz w:val="24"/>
           <w:szCs w:val="24"/>
         </w:rPr>
@@ -1221,12 +1267,14 @@
       <w:pPr>
         <w:pStyle w:val="Ttulo2"/>
         <w:rPr>
-          <w:sz w:val="24"/>
-          <w:szCs w:val="24"/>
-        </w:rPr>
-      </w:pPr>
-      <w:r>
-        <w:rPr>
+          <w:b/>
+          <w:sz w:val="24"/>
+          <w:szCs w:val="24"/>
+        </w:rPr>
+      </w:pPr>
+      <w:r>
+        <w:rPr>
+          <w:b/>
           <w:sz w:val="24"/>
           <w:szCs w:val="24"/>
         </w:rPr>
@@ -1288,12 +1336,14 @@
       <w:pPr>
         <w:pStyle w:val="Ttulo2"/>
         <w:rPr>
-          <w:sz w:val="24"/>
-          <w:szCs w:val="24"/>
-        </w:rPr>
-      </w:pPr>
-      <w:r>
-        <w:rPr>
+          <w:b/>
+          <w:sz w:val="24"/>
+          <w:szCs w:val="24"/>
+        </w:rPr>
+      </w:pPr>
+      <w:r>
+        <w:rPr>
+          <w:b/>
           <w:sz w:val="24"/>
           <w:szCs w:val="24"/>
         </w:rPr>
@@ -1345,44 +1395,100 @@
         <w:pStyle w:val="Ttulo2"/>
         <w:rPr>
           <w:rFonts w:eastAsia="Times New Roman"/>
-          <w:color w:val="auto"/>
-          <w:sz w:val="24"/>
-          <w:szCs w:val="24"/>
-        </w:rPr>
-      </w:pPr>
-    </w:p>
-    <w:p>
-      <w:pPr>
-        <w:pStyle w:val="Ttulo2"/>
-        <w:rPr>
-          <w:sz w:val="24"/>
-          <w:szCs w:val="24"/>
-        </w:rPr>
-      </w:pPr>
-      <w:r>
-        <w:rPr>
+          <w:b/>
+          <w:color w:val="auto"/>
+          <w:sz w:val="24"/>
+          <w:szCs w:val="24"/>
+        </w:rPr>
+      </w:pPr>
+    </w:p>
+    <w:p>
+      <w:pPr>
+        <w:pStyle w:val="Ttulo2"/>
+        <w:rPr>
+          <w:b/>
+          <w:color w:val="000000" w:themeColor="text1"/>
+          <w:sz w:val="24"/>
+          <w:szCs w:val="24"/>
+        </w:rPr>
+      </w:pPr>
+      <w:r>
+        <w:rPr>
+          <w:b/>
           <w:sz w:val="24"/>
           <w:szCs w:val="24"/>
         </w:rPr>
         <w:t>Implementación</w:t>
       </w:r>
-    </w:p>
-    <w:p>
-      <w:pPr>
-        <w:pStyle w:val="NormalWeb"/>
-        <w:rPr>
-          <w:rFonts w:ascii="Arial" w:hAnsi="Arial" w:cs="Arial"/>
-          <w:sz w:val="22"/>
-          <w:szCs w:val="22"/>
-        </w:rPr>
-      </w:pPr>
-      <w:r>
-        <w:rPr>
-          <w:rFonts w:ascii="Arial" w:hAnsi="Arial" w:cs="Arial"/>
+      <w:r>
+        <w:rPr>
+          <w:b/>
+          <w:sz w:val="24"/>
+          <w:szCs w:val="24"/>
+        </w:rPr>
+        <w:br/>
+      </w:r>
+      <w:r>
+        <w:rPr>
+          <w:color w:val="000000" w:themeColor="text1"/>
           <w:sz w:val="22"/>
           <w:szCs w:val="22"/>
         </w:rPr>
         <w:t>La implementación comprenderá:</w:t>
+      </w:r>
+    </w:p>
+    <w:p>
+      <w:pPr>
+        <w:pStyle w:val="Ttulo2"/>
+        <w:rPr>
+          <w:color w:val="auto"/>
+          <w:sz w:val="22"/>
+          <w:szCs w:val="22"/>
+        </w:rPr>
+      </w:pPr>
+      <w:r>
+        <w:rPr>
+          <w:color w:val="auto"/>
+          <w:sz w:val="22"/>
+          <w:szCs w:val="22"/>
+        </w:rPr>
+        <w:t xml:space="preserve">• </w:t>
+      </w:r>
+      <w:proofErr w:type="gramStart"/>
+      <w:r>
+        <w:rPr>
+          <w:color w:val="auto"/>
+          <w:sz w:val="22"/>
+          <w:szCs w:val="22"/>
+        </w:rPr>
+        <w:t>utilización</w:t>
+      </w:r>
+      <w:proofErr w:type="gramEnd"/>
+      <w:r>
+        <w:rPr>
+          <w:color w:val="auto"/>
+          <w:sz w:val="22"/>
+          <w:szCs w:val="22"/>
+        </w:rPr>
+        <w:t xml:space="preserve"> obligatoria de la plataforma </w:t>
+      </w:r>
+      <w:proofErr w:type="spellStart"/>
+      <w:r>
+        <w:rPr>
+          <w:color w:val="auto"/>
+          <w:sz w:val="22"/>
+          <w:szCs w:val="22"/>
+        </w:rPr>
+        <w:t>Redmine</w:t>
+      </w:r>
+      <w:proofErr w:type="spellEnd"/>
+      <w:r>
+        <w:rPr>
+          <w:color w:val="auto"/>
+          <w:sz w:val="22"/>
+          <w:szCs w:val="22"/>
+        </w:rPr>
+        <w:t xml:space="preserve"> para todas las solicitudes; </w:t>
       </w:r>
     </w:p>
     <w:p>
@@ -1410,7 +1516,7 @@
           <w:sz w:val="22"/>
           <w:szCs w:val="22"/>
         </w:rPr>
-        <w:t>utilización</w:t>
+        <w:t>reuniones</w:t>
       </w:r>
       <w:proofErr w:type="gramEnd"/>
       <w:r>
@@ -1419,25 +1525,7 @@
           <w:sz w:val="22"/>
           <w:szCs w:val="22"/>
         </w:rPr>
-        <w:t xml:space="preserve"> obligatoria de la plataforma </w:t>
-      </w:r>
-      <w:proofErr w:type="spellStart"/>
-      <w:r>
-        <w:rPr>
-          <w:color w:val="auto"/>
-          <w:sz w:val="22"/>
-          <w:szCs w:val="22"/>
-        </w:rPr>
-        <w:t>Redmine</w:t>
-      </w:r>
-      <w:proofErr w:type="spellEnd"/>
-      <w:r>
-        <w:rPr>
-          <w:color w:val="auto"/>
-          <w:sz w:val="22"/>
-          <w:szCs w:val="22"/>
-        </w:rPr>
-        <w:t xml:space="preserve"> para todas las solicitudes; </w:t>
+        <w:t xml:space="preserve"> periódicas de planificación y seguimiento; </w:t>
       </w:r>
     </w:p>
     <w:p>
@@ -1464,7 +1552,7 @@
           <w:sz w:val="22"/>
           <w:szCs w:val="22"/>
         </w:rPr>
-        <w:t>reuniones</w:t>
+        <w:t>revisión</w:t>
       </w:r>
       <w:proofErr w:type="gramEnd"/>
       <w:r>
@@ -1473,7 +1561,7 @@
           <w:sz w:val="22"/>
           <w:szCs w:val="22"/>
         </w:rPr>
-        <w:t xml:space="preserve"> periódicas de planificación y seguimiento; </w:t>
+        <w:t xml:space="preserve"> permanente de prioridades; </w:t>
       </w:r>
     </w:p>
     <w:p>
@@ -1500,7 +1588,7 @@
           <w:sz w:val="22"/>
           <w:szCs w:val="22"/>
         </w:rPr>
-        <w:t>revisión</w:t>
+        <w:t>redistribución</w:t>
       </w:r>
       <w:proofErr w:type="gramEnd"/>
       <w:r>
@@ -1509,7 +1597,7 @@
           <w:sz w:val="22"/>
           <w:szCs w:val="22"/>
         </w:rPr>
-        <w:t xml:space="preserve"> permanente de prioridades; </w:t>
+        <w:t xml:space="preserve"> de tareas cuando la carga operativa lo requiera;</w:t>
       </w:r>
     </w:p>
     <w:p>
@@ -1536,7 +1624,7 @@
           <w:sz w:val="22"/>
           <w:szCs w:val="22"/>
         </w:rPr>
-        <w:t>redistribución</w:t>
+        <w:t>definición</w:t>
       </w:r>
       <w:proofErr w:type="gramEnd"/>
       <w:r>
@@ -1545,7 +1633,7 @@
           <w:sz w:val="22"/>
           <w:szCs w:val="22"/>
         </w:rPr>
-        <w:t xml:space="preserve"> de tareas cuando la carga operativa lo requiera;</w:t>
+        <w:t xml:space="preserve"> de criterios para clasificar urgencias y diferir incidencias no críticas, procurando preservar capacidad operativa para el trabajo planificado, la documentación y las mejoras evolutivas;</w:t>
       </w:r>
     </w:p>
     <w:p>
@@ -1572,7 +1660,7 @@
           <w:sz w:val="22"/>
           <w:szCs w:val="22"/>
         </w:rPr>
-        <w:t>definición</w:t>
+        <w:t>estimación</w:t>
       </w:r>
       <w:proofErr w:type="gramEnd"/>
       <w:r>
@@ -1581,42 +1669,6 @@
           <w:sz w:val="22"/>
           <w:szCs w:val="22"/>
         </w:rPr>
-        <w:t xml:space="preserve"> de criterios para clasificar urgencias y diferir incidencias no críticas, procurando preservar capacidad operativa para el trabajo planificado, la documentación y las mejoras evolutivas;</w:t>
-      </w:r>
-    </w:p>
-    <w:p>
-      <w:pPr>
-        <w:pStyle w:val="Ttulo2"/>
-        <w:rPr>
-          <w:color w:val="auto"/>
-          <w:sz w:val="22"/>
-          <w:szCs w:val="22"/>
-        </w:rPr>
-      </w:pPr>
-      <w:r>
-        <w:rPr>
-          <w:color w:val="auto"/>
-          <w:sz w:val="22"/>
-          <w:szCs w:val="22"/>
-        </w:rPr>
-        <w:t xml:space="preserve">• </w:t>
-      </w:r>
-      <w:proofErr w:type="gramStart"/>
-      <w:r>
-        <w:rPr>
-          <w:color w:val="auto"/>
-          <w:sz w:val="22"/>
-          <w:szCs w:val="22"/>
-        </w:rPr>
-        <w:t>estimación</w:t>
-      </w:r>
-      <w:proofErr w:type="gramEnd"/>
-      <w:r>
-        <w:rPr>
-          <w:color w:val="auto"/>
-          <w:sz w:val="22"/>
-          <w:szCs w:val="22"/>
-        </w:rPr>
         <w:t xml:space="preserve"> de tiempos y tipificación en cada petición para habilitar el seguimiento efectivo del cronograma mediante el diagrama Gantt.</w:t>
       </w:r>
     </w:p>
@@ -1634,12 +1686,14 @@
       <w:pPr>
         <w:pStyle w:val="Ttulo2"/>
         <w:rPr>
-          <w:sz w:val="24"/>
-          <w:szCs w:val="24"/>
-        </w:rPr>
-      </w:pPr>
-      <w:r>
-        <w:rPr>
+          <w:b/>
+          <w:sz w:val="24"/>
+          <w:szCs w:val="24"/>
+        </w:rPr>
+      </w:pPr>
+      <w:r>
+        <w:rPr>
+          <w:b/>
           <w:sz w:val="24"/>
           <w:szCs w:val="24"/>
         </w:rPr>
@@ -1659,12 +1713,14 @@
       <w:pPr>
         <w:pStyle w:val="Ttulo1"/>
         <w:rPr>
+          <w:b/>
           <w:sz w:val="26"/>
           <w:szCs w:val="26"/>
         </w:rPr>
       </w:pPr>
       <w:r>
         <w:rPr>
+          <w:b/>
           <w:sz w:val="26"/>
           <w:szCs w:val="26"/>
         </w:rPr>
@@ -1675,12 +1731,14 @@
       <w:pPr>
         <w:pStyle w:val="Ttulo2"/>
         <w:rPr>
-          <w:sz w:val="24"/>
-          <w:szCs w:val="24"/>
-        </w:rPr>
-      </w:pPr>
-      <w:r>
-        <w:rPr>
+          <w:b/>
+          <w:sz w:val="24"/>
+          <w:szCs w:val="24"/>
+        </w:rPr>
+      </w:pPr>
+      <w:r>
+        <w:rPr>
+          <w:b/>
           <w:sz w:val="24"/>
           <w:szCs w:val="24"/>
         </w:rPr>
@@ -1722,12 +1780,14 @@
       <w:pPr>
         <w:pStyle w:val="Ttulo2"/>
         <w:rPr>
-          <w:sz w:val="24"/>
-          <w:szCs w:val="24"/>
-        </w:rPr>
-      </w:pPr>
-      <w:r>
-        <w:rPr>
+          <w:b/>
+          <w:sz w:val="24"/>
+          <w:szCs w:val="24"/>
+        </w:rPr>
+      </w:pPr>
+      <w:r>
+        <w:rPr>
+          <w:b/>
           <w:sz w:val="24"/>
           <w:szCs w:val="24"/>
         </w:rPr>
@@ -1762,12 +1822,14 @@
       <w:pPr>
         <w:pStyle w:val="Ttulo2"/>
         <w:rPr>
-          <w:sz w:val="24"/>
-          <w:szCs w:val="24"/>
-        </w:rPr>
-      </w:pPr>
-      <w:r>
-        <w:rPr>
+          <w:b/>
+          <w:sz w:val="24"/>
+          <w:szCs w:val="24"/>
+        </w:rPr>
+      </w:pPr>
+      <w:r>
+        <w:rPr>
+          <w:b/>
           <w:sz w:val="24"/>
           <w:szCs w:val="24"/>
         </w:rPr>
@@ -2002,12 +2064,14 @@
       <w:pPr>
         <w:pStyle w:val="Ttulo2"/>
         <w:rPr>
-          <w:sz w:val="24"/>
-          <w:szCs w:val="24"/>
-        </w:rPr>
-      </w:pPr>
-      <w:r>
-        <w:rPr>
+          <w:b/>
+          <w:sz w:val="24"/>
+          <w:szCs w:val="24"/>
+        </w:rPr>
+      </w:pPr>
+      <w:r>
+        <w:rPr>
+          <w:b/>
           <w:sz w:val="24"/>
           <w:szCs w:val="24"/>
         </w:rPr>
@@ -2029,7 +2093,25 @@
           <w:sz w:val="22"/>
           <w:szCs w:val="22"/>
         </w:rPr>
-        <w:t>La medida reducirá significativamente el riesgo operativo, facilitará la redistribución de tareas y permitirá preservar el conocimiento institucional generado por el Departamento.</w:t>
+        <w:t xml:space="preserve">La medida reducirá significativamente el riesgo operativo, facilitará la redistribución de tareas y </w:t>
+      </w:r>
+      <w:proofErr w:type="gramStart"/>
+      <w:r>
+        <w:rPr>
+          <w:rFonts w:ascii="Arial" w:hAnsi="Arial" w:cs="Arial"/>
+          <w:sz w:val="22"/>
+          <w:szCs w:val="22"/>
+        </w:rPr>
+        <w:t>permitirá</w:t>
+      </w:r>
+      <w:proofErr w:type="gramEnd"/>
+      <w:r>
+        <w:rPr>
+          <w:rFonts w:ascii="Arial" w:hAnsi="Arial" w:cs="Arial"/>
+          <w:sz w:val="22"/>
+          <w:szCs w:val="22"/>
+        </w:rPr>
+        <w:t xml:space="preserve"> preservar el conocimiento institucional generado por el Departamento.</w:t>
       </w:r>
     </w:p>
     <w:p/>
@@ -2037,32 +2119,36 @@
       <w:pPr>
         <w:pStyle w:val="Ttulo1"/>
         <w:rPr>
+          <w:b/>
           <w:sz w:val="26"/>
           <w:szCs w:val="26"/>
         </w:rPr>
       </w:pPr>
       <w:r>
         <w:rPr>
+          <w:b/>
           <w:sz w:val="26"/>
           <w:szCs w:val="26"/>
         </w:rPr>
+        <w:t>5.3 Estandarización técnica y calidad del software</w:t>
+      </w:r>
+    </w:p>
+    <w:p>
+      <w:pPr>
+        <w:pStyle w:val="Ttulo2"/>
+        <w:rPr>
+          <w:b/>
+          <w:sz w:val="24"/>
+          <w:szCs w:val="24"/>
+        </w:rPr>
+      </w:pPr>
+      <w:r>
+        <w:rPr>
+          <w:b/>
+          <w:sz w:val="24"/>
+          <w:szCs w:val="24"/>
+        </w:rPr>
         <w:lastRenderedPageBreak/>
-        <w:t>5.3 Estandarización técnica y calidad del software</w:t>
-      </w:r>
-    </w:p>
-    <w:p>
-      <w:pPr>
-        <w:pStyle w:val="Ttulo2"/>
-        <w:rPr>
-          <w:sz w:val="24"/>
-          <w:szCs w:val="24"/>
-        </w:rPr>
-      </w:pPr>
-      <w:r>
-        <w:rPr>
-          <w:sz w:val="24"/>
-          <w:szCs w:val="24"/>
-        </w:rPr>
         <w:t>Problema</w:t>
       </w:r>
     </w:p>
@@ -2088,12 +2174,14 @@
       <w:pPr>
         <w:pStyle w:val="Ttulo2"/>
         <w:rPr>
-          <w:sz w:val="24"/>
-          <w:szCs w:val="24"/>
-        </w:rPr>
-      </w:pPr>
-      <w:r>
-        <w:rPr>
+          <w:b/>
+          <w:sz w:val="24"/>
+          <w:szCs w:val="24"/>
+        </w:rPr>
+      </w:pPr>
+      <w:r>
+        <w:rPr>
+          <w:b/>
           <w:sz w:val="24"/>
           <w:szCs w:val="24"/>
         </w:rPr>
@@ -2136,12 +2224,14 @@
       <w:pPr>
         <w:pStyle w:val="Ttulo2"/>
         <w:rPr>
-          <w:sz w:val="24"/>
-          <w:szCs w:val="24"/>
-        </w:rPr>
-      </w:pPr>
-      <w:r>
-        <w:rPr>
+          <w:b/>
+          <w:sz w:val="24"/>
+          <w:szCs w:val="24"/>
+        </w:rPr>
+      </w:pPr>
+      <w:r>
+        <w:rPr>
+          <w:b/>
           <w:sz w:val="24"/>
           <w:szCs w:val="24"/>
         </w:rPr>
@@ -2244,12 +2334,14 @@
       <w:pPr>
         <w:pStyle w:val="Ttulo2"/>
         <w:rPr>
-          <w:sz w:val="24"/>
-          <w:szCs w:val="24"/>
-        </w:rPr>
-      </w:pPr>
-      <w:r>
-        <w:rPr>
+          <w:b/>
+          <w:sz w:val="24"/>
+          <w:szCs w:val="24"/>
+        </w:rPr>
+      </w:pPr>
+      <w:r>
+        <w:rPr>
+          <w:b/>
           <w:sz w:val="24"/>
           <w:szCs w:val="24"/>
         </w:rPr>
@@ -2279,12 +2371,14 @@
       <w:pPr>
         <w:pStyle w:val="Ttulo1"/>
         <w:rPr>
+          <w:b/>
           <w:sz w:val="26"/>
           <w:szCs w:val="26"/>
         </w:rPr>
       </w:pPr>
       <w:r>
         <w:rPr>
+          <w:b/>
           <w:sz w:val="26"/>
           <w:szCs w:val="26"/>
         </w:rPr>
@@ -2295,12 +2389,14 @@
       <w:pPr>
         <w:pStyle w:val="Ttulo2"/>
         <w:rPr>
-          <w:sz w:val="24"/>
-          <w:szCs w:val="24"/>
-        </w:rPr>
-      </w:pPr>
-      <w:r>
-        <w:rPr>
+          <w:b/>
+          <w:sz w:val="24"/>
+          <w:szCs w:val="24"/>
+        </w:rPr>
+      </w:pPr>
+      <w:r>
+        <w:rPr>
+          <w:b/>
           <w:sz w:val="24"/>
           <w:szCs w:val="24"/>
         </w:rPr>
@@ -2329,12 +2425,14 @@
       <w:pPr>
         <w:pStyle w:val="Ttulo2"/>
         <w:rPr>
-          <w:sz w:val="24"/>
-          <w:szCs w:val="24"/>
-        </w:rPr>
-      </w:pPr>
-      <w:r>
-        <w:rPr>
+          <w:b/>
+          <w:sz w:val="24"/>
+          <w:szCs w:val="24"/>
+        </w:rPr>
+      </w:pPr>
+      <w:r>
+        <w:rPr>
+          <w:b/>
           <w:sz w:val="24"/>
           <w:szCs w:val="24"/>
         </w:rPr>
@@ -2367,12 +2465,14 @@
       <w:pPr>
         <w:pStyle w:val="Ttulo2"/>
         <w:rPr>
-          <w:sz w:val="24"/>
-          <w:szCs w:val="24"/>
-        </w:rPr>
-      </w:pPr>
-      <w:r>
-        <w:rPr>
+          <w:b/>
+          <w:sz w:val="24"/>
+          <w:szCs w:val="24"/>
+        </w:rPr>
+      </w:pPr>
+      <w:r>
+        <w:rPr>
+          <w:b/>
           <w:sz w:val="24"/>
           <w:szCs w:val="24"/>
         </w:rPr>
@@ -2446,7 +2546,6 @@
         <w:jc w:val="left"/>
       </w:pPr>
       <w:r>
-        <w:lastRenderedPageBreak/>
         <w:t xml:space="preserve">prioridad; </w:t>
       </w:r>
     </w:p>
@@ -2473,6 +2572,7 @@
         <w:jc w:val="left"/>
       </w:pPr>
       <w:r>
+        <w:lastRenderedPageBreak/>
         <w:t>impacto e integración con otros sistemas municipales;</w:t>
       </w:r>
     </w:p>
@@ -2506,12 +2606,14 @@
       <w:pPr>
         <w:pStyle w:val="Ttulo2"/>
         <w:rPr>
-          <w:sz w:val="24"/>
-          <w:szCs w:val="24"/>
-        </w:rPr>
-      </w:pPr>
-      <w:r>
-        <w:rPr>
+          <w:b/>
+          <w:sz w:val="24"/>
+          <w:szCs w:val="24"/>
+        </w:rPr>
+      </w:pPr>
+      <w:r>
+        <w:rPr>
+          <w:b/>
           <w:sz w:val="24"/>
           <w:szCs w:val="24"/>
         </w:rPr>
@@ -2541,12 +2643,14 @@
       <w:pPr>
         <w:pStyle w:val="Ttulo1"/>
         <w:rPr>
+          <w:b/>
           <w:sz w:val="28"/>
           <w:szCs w:val="28"/>
         </w:rPr>
       </w:pPr>
       <w:r>
         <w:rPr>
+          <w:b/>
           <w:sz w:val="28"/>
           <w:szCs w:val="28"/>
         </w:rPr>
@@ -2557,12 +2661,14 @@
       <w:pPr>
         <w:pStyle w:val="Ttulo2"/>
         <w:rPr>
-          <w:sz w:val="24"/>
-          <w:szCs w:val="24"/>
-        </w:rPr>
-      </w:pPr>
-      <w:r>
-        <w:rPr>
+          <w:b/>
+          <w:sz w:val="24"/>
+          <w:szCs w:val="24"/>
+        </w:rPr>
+      </w:pPr>
+      <w:r>
+        <w:rPr>
+          <w:b/>
           <w:sz w:val="24"/>
           <w:szCs w:val="24"/>
         </w:rPr>
@@ -2604,12 +2710,14 @@
       <w:pPr>
         <w:pStyle w:val="Ttulo2"/>
         <w:rPr>
-          <w:sz w:val="24"/>
-          <w:szCs w:val="24"/>
-        </w:rPr>
-      </w:pPr>
-      <w:r>
-        <w:rPr>
+          <w:b/>
+          <w:sz w:val="24"/>
+          <w:szCs w:val="24"/>
+        </w:rPr>
+      </w:pPr>
+      <w:r>
+        <w:rPr>
+          <w:b/>
           <w:sz w:val="24"/>
           <w:szCs w:val="24"/>
         </w:rPr>
@@ -2651,12 +2759,14 @@
       <w:pPr>
         <w:pStyle w:val="Ttulo2"/>
         <w:rPr>
-          <w:sz w:val="24"/>
-          <w:szCs w:val="24"/>
-        </w:rPr>
-      </w:pPr>
-      <w:r>
-        <w:rPr>
+          <w:b/>
+          <w:sz w:val="24"/>
+          <w:szCs w:val="24"/>
+        </w:rPr>
+      </w:pPr>
+      <w:r>
+        <w:rPr>
+          <w:b/>
           <w:sz w:val="24"/>
           <w:szCs w:val="24"/>
         </w:rPr>
@@ -2761,21 +2871,16 @@
     </w:p>
     <w:p>
       <w:pPr>
-        <w:spacing w:before="100" w:beforeAutospacing="1" w:afterAutospacing="1" w:line="240" w:lineRule="auto"/>
-        <w:ind w:left="720"/>
-        <w:jc w:val="left"/>
-      </w:pPr>
-    </w:p>
-    <w:p>
-      <w:pPr>
-        <w:pStyle w:val="Ttulo2"/>
-        <w:rPr>
-          <w:sz w:val="24"/>
-          <w:szCs w:val="24"/>
-        </w:rPr>
-      </w:pPr>
-      <w:r>
-        <w:rPr>
+        <w:pStyle w:val="Ttulo2"/>
+        <w:rPr>
+          <w:b/>
+          <w:sz w:val="24"/>
+          <w:szCs w:val="24"/>
+        </w:rPr>
+      </w:pPr>
+      <w:r>
+        <w:rPr>
+          <w:b/>
           <w:sz w:val="24"/>
           <w:szCs w:val="24"/>
         </w:rPr>
@@ -2800,12 +2905,14 @@
       <w:pPr>
         <w:pStyle w:val="Ttulo1"/>
         <w:rPr>
+          <w:b/>
           <w:sz w:val="26"/>
           <w:szCs w:val="26"/>
         </w:rPr>
       </w:pPr>
       <w:r>
         <w:rPr>
+          <w:b/>
           <w:sz w:val="26"/>
           <w:szCs w:val="26"/>
         </w:rPr>
@@ -2816,12 +2923,14 @@
       <w:pPr>
         <w:pStyle w:val="Ttulo2"/>
         <w:rPr>
-          <w:sz w:val="24"/>
-          <w:szCs w:val="24"/>
-        </w:rPr>
-      </w:pPr>
-      <w:r>
-        <w:rPr>
+          <w:b/>
+          <w:sz w:val="24"/>
+          <w:szCs w:val="24"/>
+        </w:rPr>
+      </w:pPr>
+      <w:r>
+        <w:rPr>
+          <w:b/>
           <w:sz w:val="24"/>
           <w:szCs w:val="24"/>
         </w:rPr>
@@ -2845,7 +2954,6 @@
           <w:sz w:val="22"/>
           <w:szCs w:val="22"/>
         </w:rPr>
-        <w:lastRenderedPageBreak/>
         <w:t>La incorporación de nuevas herramientas y tecnologías suele realizarse sin criterios institucionales comunes, quedando muchas veces librada a decisiones individuales. Asimismo, la coexistencia de tecnologías obsoletas y plataformas con soporte vigente dificulta la estandarización del desarrollo y la evolución tecnológica del Departamento.</w:t>
       </w:r>
     </w:p>
@@ -2864,12 +2972,14 @@
       <w:pPr>
         <w:pStyle w:val="Ttulo2"/>
         <w:rPr>
-          <w:sz w:val="24"/>
-          <w:szCs w:val="24"/>
-        </w:rPr>
-      </w:pPr>
-      <w:r>
-        <w:rPr>
+          <w:b/>
+          <w:sz w:val="24"/>
+          <w:szCs w:val="24"/>
+        </w:rPr>
+      </w:pPr>
+      <w:r>
+        <w:rPr>
+          <w:b/>
           <w:sz w:val="24"/>
           <w:szCs w:val="24"/>
         </w:rPr>
@@ -2931,12 +3041,14 @@
       <w:pPr>
         <w:pStyle w:val="Ttulo2"/>
         <w:rPr>
-          <w:sz w:val="24"/>
-          <w:szCs w:val="24"/>
-        </w:rPr>
-      </w:pPr>
-      <w:r>
-        <w:rPr>
+          <w:b/>
+          <w:sz w:val="24"/>
+          <w:szCs w:val="24"/>
+        </w:rPr>
+      </w:pPr>
+      <w:r>
+        <w:rPr>
+          <w:b/>
           <w:sz w:val="24"/>
           <w:szCs w:val="24"/>
         </w:rPr>
@@ -3141,12 +3253,14 @@
       <w:pPr>
         <w:pStyle w:val="Ttulo2"/>
         <w:rPr>
-          <w:sz w:val="24"/>
-          <w:szCs w:val="24"/>
-        </w:rPr>
-      </w:pPr>
-      <w:r>
-        <w:rPr>
+          <w:b/>
+          <w:sz w:val="24"/>
+          <w:szCs w:val="24"/>
+        </w:rPr>
+      </w:pPr>
+      <w:r>
+        <w:rPr>
+          <w:b/>
           <w:sz w:val="24"/>
           <w:szCs w:val="24"/>
         </w:rPr>
@@ -3179,12 +3293,14 @@
       <w:pPr>
         <w:pStyle w:val="Ttulo1"/>
         <w:rPr>
+          <w:b/>
           <w:sz w:val="26"/>
           <w:szCs w:val="26"/>
         </w:rPr>
       </w:pPr>
       <w:r>
         <w:rPr>
+          <w:b/>
           <w:sz w:val="26"/>
           <w:szCs w:val="26"/>
         </w:rPr>
@@ -3195,12 +3311,14 @@
       <w:pPr>
         <w:pStyle w:val="Ttulo2"/>
         <w:rPr>
-          <w:sz w:val="24"/>
-          <w:szCs w:val="24"/>
-        </w:rPr>
-      </w:pPr>
-      <w:r>
-        <w:rPr>
+          <w:b/>
+          <w:sz w:val="24"/>
+          <w:szCs w:val="24"/>
+        </w:rPr>
+      </w:pPr>
+      <w:r>
+        <w:rPr>
+          <w:b/>
           <w:sz w:val="24"/>
           <w:szCs w:val="24"/>
         </w:rPr>
@@ -3237,6 +3355,7 @@
       <w:pPr>
         <w:pStyle w:val="Ttulo2"/>
         <w:rPr>
+          <w:b/>
           <w:sz w:val="24"/>
           <w:szCs w:val="24"/>
         </w:rPr>
@@ -3247,6 +3366,13 @@
           <w:szCs w:val="24"/>
         </w:rPr>
         <w:br/>
+      </w:r>
+      <w:r>
+        <w:rPr>
+          <w:b/>
+          <w:sz w:val="24"/>
+          <w:szCs w:val="24"/>
+        </w:rPr>
         <w:t>Propuesta</w:t>
       </w:r>
     </w:p>
@@ -3277,12 +3403,14 @@
       <w:pPr>
         <w:pStyle w:val="Ttulo2"/>
         <w:rPr>
-          <w:sz w:val="24"/>
-          <w:szCs w:val="24"/>
-        </w:rPr>
-      </w:pPr>
-      <w:r>
-        <w:rPr>
+          <w:b/>
+          <w:sz w:val="24"/>
+          <w:szCs w:val="24"/>
+        </w:rPr>
+      </w:pPr>
+      <w:r>
+        <w:rPr>
+          <w:b/>
           <w:sz w:val="24"/>
           <w:szCs w:val="24"/>
         </w:rPr>
@@ -3323,7 +3451,6 @@
         <w:rPr>
           <w:rFonts w:eastAsia="Times New Roman"/>
         </w:rPr>
-        <w:lastRenderedPageBreak/>
         <w:t>reuniones periódicas breves de sincronización inter-oficinas con agenda predefinida;</w:t>
       </w:r>
     </w:p>
@@ -3376,6 +3503,7 @@
         <w:rPr>
           <w:rFonts w:eastAsia="Times New Roman"/>
         </w:rPr>
+        <w:lastRenderedPageBreak/>
         <w:t>criterios comunes para registrar avances, bloqueos y decisiones técnicas relevantes;</w:t>
       </w:r>
     </w:p>
@@ -3411,12 +3539,14 @@
       <w:pPr>
         <w:pStyle w:val="Ttulo2"/>
         <w:rPr>
-          <w:sz w:val="24"/>
-          <w:szCs w:val="24"/>
-        </w:rPr>
-      </w:pPr>
-      <w:r>
-        <w:rPr>
+          <w:b/>
+          <w:sz w:val="24"/>
+          <w:szCs w:val="24"/>
+        </w:rPr>
+      </w:pPr>
+      <w:r>
+        <w:rPr>
+          <w:b/>
           <w:sz w:val="24"/>
           <w:szCs w:val="24"/>
         </w:rPr>
@@ -3449,12 +3579,14 @@
       <w:pPr>
         <w:pStyle w:val="Ttulo1"/>
         <w:rPr>
+          <w:b/>
           <w:sz w:val="26"/>
           <w:szCs w:val="26"/>
         </w:rPr>
       </w:pPr>
       <w:r>
         <w:rPr>
+          <w:b/>
           <w:sz w:val="26"/>
           <w:szCs w:val="26"/>
         </w:rPr>
@@ -3465,12 +3597,14 @@
       <w:pPr>
         <w:pStyle w:val="Ttulo2"/>
         <w:rPr>
-          <w:sz w:val="24"/>
-          <w:szCs w:val="24"/>
-        </w:rPr>
-      </w:pPr>
-      <w:r>
-        <w:rPr>
+          <w:b/>
+          <w:sz w:val="24"/>
+          <w:szCs w:val="24"/>
+        </w:rPr>
+      </w:pPr>
+      <w:r>
+        <w:rPr>
+          <w:b/>
           <w:sz w:val="24"/>
           <w:szCs w:val="24"/>
         </w:rPr>
@@ -3510,31 +3644,14 @@
           <w:sz w:val="22"/>
           <w:szCs w:val="22"/>
         </w:rPr>
-        <w:t xml:space="preserve">, lo que dificulta la conformación de </w:t>
-      </w:r>
-      <w:proofErr w:type="gramStart"/>
-      <w:r>
-        <w:rPr>
-          <w:color w:val="auto"/>
-          <w:sz w:val="22"/>
-          <w:szCs w:val="22"/>
-        </w:rPr>
-        <w:t>equipos</w:t>
-      </w:r>
-      <w:proofErr w:type="gramEnd"/>
-      <w:r>
-        <w:rPr>
-          <w:color w:val="auto"/>
-          <w:sz w:val="22"/>
-          <w:szCs w:val="22"/>
-        </w:rPr>
-        <w:t xml:space="preserve"> con roles claramente diferenciados.</w:t>
-      </w:r>
-    </w:p>
-    <w:p>
-      <w:pPr>
-        <w:pStyle w:val="Ttulo2"/>
-        <w:rPr>
+        <w:t>, lo que dificulta la conformación de equipos con roles claramente diferenciados.</w:t>
+      </w:r>
+    </w:p>
+    <w:p>
+      <w:pPr>
+        <w:pStyle w:val="Ttulo2"/>
+        <w:rPr>
+          <w:b/>
           <w:sz w:val="24"/>
           <w:szCs w:val="24"/>
         </w:rPr>
@@ -3544,6 +3661,7 @@
       </w:r>
       <w:r>
         <w:rPr>
+          <w:b/>
           <w:sz w:val="24"/>
           <w:szCs w:val="24"/>
         </w:rPr>
@@ -3595,12 +3713,14 @@
       <w:pPr>
         <w:pStyle w:val="Ttulo2"/>
         <w:rPr>
-          <w:sz w:val="24"/>
-          <w:szCs w:val="24"/>
-        </w:rPr>
-      </w:pPr>
-      <w:r>
-        <w:rPr>
+          <w:b/>
+          <w:sz w:val="24"/>
+          <w:szCs w:val="24"/>
+        </w:rPr>
+      </w:pPr>
+      <w:r>
+        <w:rPr>
+          <w:b/>
           <w:sz w:val="24"/>
           <w:szCs w:val="24"/>
         </w:rPr>
@@ -3758,12 +3878,14 @@
       <w:pPr>
         <w:pStyle w:val="Ttulo2"/>
         <w:rPr>
-          <w:sz w:val="24"/>
-          <w:szCs w:val="24"/>
-        </w:rPr>
-      </w:pPr>
-      <w:r>
-        <w:rPr>
+          <w:b/>
+          <w:sz w:val="24"/>
+          <w:szCs w:val="24"/>
+        </w:rPr>
+      </w:pPr>
+      <w:r>
+        <w:rPr>
+          <w:b/>
           <w:sz w:val="24"/>
           <w:szCs w:val="24"/>
         </w:rPr>
@@ -3795,17 +3917,37 @@
       <w:pPr>
         <w:pStyle w:val="Ttulo1"/>
         <w:rPr>
+          <w:b/>
           <w:sz w:val="28"/>
           <w:szCs w:val="28"/>
         </w:rPr>
       </w:pPr>
       <w:r>
         <w:rPr>
+          <w:b/>
           <w:sz w:val="28"/>
           <w:szCs w:val="28"/>
         </w:rPr>
+        <w:t>6. PROYECCIÓN CON INCORPORACIÓN DE RECURSOS</w:t>
+      </w:r>
+    </w:p>
+    <w:p>
+      <w:pPr>
+        <w:pStyle w:val="NormalWeb"/>
+        <w:rPr>
+          <w:rFonts w:ascii="Arial" w:hAnsi="Arial" w:cs="Arial"/>
+          <w:sz w:val="22"/>
+          <w:szCs w:val="22"/>
+        </w:rPr>
+      </w:pPr>
+      <w:r>
+        <w:rPr>
+          <w:rFonts w:ascii="Arial" w:hAnsi="Arial" w:cs="Arial"/>
+          <w:sz w:val="22"/>
+          <w:szCs w:val="22"/>
+        </w:rPr>
         <w:lastRenderedPageBreak/>
-        <w:t>6. PROYECCIÓN CON INCORPORACIÓN DE RECURSOS</w:t>
+        <w:t>Las acciones desarrolladas en el capítulo anterior pueden implementarse utilizando los recursos actualmente disponibles y constituyen una estrategia realista para mejorar el funcionamiento del Departamento.</w:t>
       </w:r>
     </w:p>
     <w:p>
@@ -3823,7 +3965,7 @@
           <w:sz w:val="22"/>
           <w:szCs w:val="22"/>
         </w:rPr>
-        <w:t>Las acciones desarrolladas en el capítulo anterior pueden implementarse utilizando los recursos actualmente disponibles y constituyen una estrategia realista para mejorar el funcionamiento del Departamento.</w:t>
+        <w:t>No obstante, la incorporación gradual de recursos presupuestarios permitiría consolidar y potenciar dichas acciones, incrementando la productividad del equipo, fortaleciendo la calidad del software y acelerando el proceso de modernización tecnológica.</w:t>
       </w:r>
     </w:p>
     <w:p>
@@ -3841,7 +3983,7 @@
           <w:sz w:val="22"/>
           <w:szCs w:val="22"/>
         </w:rPr>
-        <w:t>No obstante, la incorporación gradual de recursos presupuestarios permitiría consolidar y potenciar dichas acciones, incrementando la productividad del equipo, fortaleciendo la calidad del software y acelerando el proceso de modernización tecnológica.</w:t>
+        <w:t>Las líneas de inversión identificadas no constituyen compromisos de adquisición ni requieren una ejecución simultánea, sino alternativas que podrán evaluarse en función de las necesidades detectadas, la disponibilidad presupuestaria y las prioridades institucionales.</w:t>
       </w:r>
     </w:p>
     <w:p>
@@ -3859,24 +4001,6 @@
           <w:sz w:val="22"/>
           <w:szCs w:val="22"/>
         </w:rPr>
-        <w:t>Las líneas de inversión identificadas no constituyen compromisos de adquisición ni requieren una ejecución simultánea, sino alternativas que podrán evaluarse en función de las necesidades detectadas, la disponibilidad presupuestaria y las prioridades institucionales.</w:t>
-      </w:r>
-    </w:p>
-    <w:p>
-      <w:pPr>
-        <w:pStyle w:val="NormalWeb"/>
-        <w:rPr>
-          <w:rFonts w:ascii="Arial" w:hAnsi="Arial" w:cs="Arial"/>
-          <w:sz w:val="22"/>
-          <w:szCs w:val="22"/>
-        </w:rPr>
-      </w:pPr>
-      <w:r>
-        <w:rPr>
-          <w:rFonts w:ascii="Arial" w:hAnsi="Arial" w:cs="Arial"/>
-          <w:sz w:val="22"/>
-          <w:szCs w:val="22"/>
-        </w:rPr>
         <w:t>En este contexto, se identifican las siguientes líneas de inversión prioritaria.</w:t>
       </w:r>
     </w:p>
@@ -3884,8 +4008,14 @@
     <w:p>
       <w:pPr>
         <w:pStyle w:val="Ttulo2"/>
-      </w:pPr>
-      <w:r>
+        <w:rPr>
+          <w:b/>
+        </w:rPr>
+      </w:pPr>
+      <w:r>
+        <w:rPr>
+          <w:b/>
+        </w:rPr>
         <w:t>6.1 Incorporación de herramientas profesionales de apoyo al desarrollo y asistencia técnica</w:t>
       </w:r>
     </w:p>
@@ -3893,12 +4023,14 @@
       <w:pPr>
         <w:pStyle w:val="Ttulo2"/>
         <w:rPr>
-          <w:sz w:val="24"/>
-          <w:szCs w:val="24"/>
-        </w:rPr>
-      </w:pPr>
-      <w:r>
-        <w:rPr>
+          <w:b/>
+          <w:sz w:val="24"/>
+          <w:szCs w:val="24"/>
+        </w:rPr>
+      </w:pPr>
+      <w:r>
+        <w:rPr>
+          <w:b/>
           <w:sz w:val="24"/>
           <w:szCs w:val="24"/>
         </w:rPr>
@@ -3927,6 +4059,7 @@
       <w:pPr>
         <w:pStyle w:val="Ttulo2"/>
         <w:rPr>
+          <w:b/>
           <w:sz w:val="24"/>
           <w:szCs w:val="24"/>
         </w:rPr>
@@ -3936,6 +4069,7 @@
       </w:r>
       <w:r>
         <w:rPr>
+          <w:b/>
           <w:sz w:val="24"/>
           <w:szCs w:val="24"/>
         </w:rPr>
@@ -3969,12 +4103,14 @@
       <w:pPr>
         <w:pStyle w:val="Ttulo2"/>
         <w:rPr>
-          <w:sz w:val="24"/>
-          <w:szCs w:val="24"/>
-        </w:rPr>
-      </w:pPr>
-      <w:r>
-        <w:rPr>
+          <w:b/>
+          <w:sz w:val="24"/>
+          <w:szCs w:val="24"/>
+        </w:rPr>
+      </w:pPr>
+      <w:r>
+        <w:rPr>
+          <w:b/>
           <w:sz w:val="24"/>
           <w:szCs w:val="24"/>
         </w:rPr>
@@ -4114,12 +4250,14 @@
       <w:pPr>
         <w:pStyle w:val="Ttulo2"/>
         <w:rPr>
-          <w:sz w:val="24"/>
-          <w:szCs w:val="24"/>
-        </w:rPr>
-      </w:pPr>
-      <w:r>
-        <w:rPr>
+          <w:b/>
+          <w:sz w:val="24"/>
+          <w:szCs w:val="24"/>
+        </w:rPr>
+      </w:pPr>
+      <w:r>
+        <w:rPr>
+          <w:b/>
           <w:sz w:val="24"/>
           <w:szCs w:val="24"/>
         </w:rPr>
@@ -4136,44 +4274,74 @@
         <w:rPr>
           <w:rFonts w:eastAsia="Times New Roman"/>
         </w:rPr>
-        <w:t>Se incrementará sustancialmente la productividad del equipo, mejorará la calidad de los desarrollos, se reducirán los tiempos destinados a tareas repetitivas y se automatizará la documentación técnica de los sistemas.</w:t>
+        <w:t xml:space="preserve">Se incrementará sustancialmente la productividad del equipo, mejorará la calidad de los </w:t>
+      </w:r>
+      <w:proofErr w:type="gramStart"/>
+      <w:r>
+        <w:rPr>
+          <w:rFonts w:eastAsia="Times New Roman"/>
+        </w:rPr>
+        <w:t>desarrollos</w:t>
+      </w:r>
+      <w:proofErr w:type="gramEnd"/>
+      <w:r>
+        <w:rPr>
+          <w:rFonts w:eastAsia="Times New Roman"/>
+        </w:rPr>
+        <w:t>, se reducirán los tiempos destinados a tareas repetitivas y se automatizará la documentación técnica de los sistemas.</w:t>
       </w:r>
     </w:p>
     <w:p/>
     <w:p>
       <w:pPr>
         <w:pStyle w:val="Ttulo2"/>
-      </w:pPr>
-      <w:r>
+        <w:rPr>
+          <w:b/>
+        </w:rPr>
+      </w:pPr>
+      <w:r>
+        <w:rPr>
+          <w:b/>
+        </w:rPr>
         <w:t>6.2 Programa permanente de capacitación continua y especialización del personal</w:t>
       </w:r>
     </w:p>
     <w:p>
       <w:pPr>
         <w:pStyle w:val="Ttulo2"/>
-      </w:pPr>
-      <w:r>
+        <w:rPr>
+          <w:b/>
+          <w:sz w:val="24"/>
+          <w:szCs w:val="24"/>
+        </w:rPr>
+      </w:pPr>
+      <w:r>
+        <w:rPr>
+          <w:b/>
+          <w:sz w:val="24"/>
+          <w:szCs w:val="24"/>
+        </w:rPr>
+        <w:t>Problema</w:t>
+      </w:r>
+    </w:p>
+    <w:p>
+      <w:pPr>
+        <w:pStyle w:val="Ttulo2"/>
+        <w:rPr>
+          <w:rFonts w:eastAsia="Times New Roman"/>
+          <w:color w:val="auto"/>
+          <w:sz w:val="22"/>
+          <w:szCs w:val="22"/>
+        </w:rPr>
+      </w:pPr>
+      <w:r>
+        <w:rPr>
+          <w:rFonts w:eastAsia="Times New Roman"/>
+          <w:color w:val="auto"/>
+          <w:sz w:val="22"/>
+          <w:szCs w:val="22"/>
+        </w:rPr>
         <w:lastRenderedPageBreak/>
-        <w:t>Problema</w:t>
-      </w:r>
-    </w:p>
-    <w:p>
-      <w:pPr>
-        <w:pStyle w:val="Ttulo2"/>
-        <w:rPr>
-          <w:rFonts w:eastAsia="Times New Roman"/>
-          <w:color w:val="auto"/>
-          <w:sz w:val="22"/>
-          <w:szCs w:val="22"/>
-        </w:rPr>
-      </w:pPr>
-      <w:r>
-        <w:rPr>
-          <w:rFonts w:eastAsia="Times New Roman"/>
-          <w:color w:val="auto"/>
-          <w:sz w:val="22"/>
-          <w:szCs w:val="22"/>
-        </w:rPr>
         <w:t>La rápida evolución de lenguajes, metodologías y arquitecturas requiere instancias de formación especializada para actualizar constantemente al equipo más allá del aprendizaje autónomo.</w:t>
       </w:r>
     </w:p>
@@ -4181,6 +4349,7 @@
       <w:pPr>
         <w:pStyle w:val="Ttulo2"/>
         <w:rPr>
+          <w:b/>
           <w:sz w:val="24"/>
           <w:szCs w:val="24"/>
         </w:rPr>
@@ -4190,6 +4359,7 @@
       </w:r>
       <w:r>
         <w:rPr>
+          <w:b/>
           <w:sz w:val="24"/>
           <w:szCs w:val="24"/>
         </w:rPr>
@@ -4229,12 +4399,14 @@
       <w:pPr>
         <w:pStyle w:val="Ttulo2"/>
         <w:rPr>
-          <w:sz w:val="24"/>
-          <w:szCs w:val="24"/>
-        </w:rPr>
-      </w:pPr>
-      <w:r>
-        <w:rPr>
+          <w:b/>
+          <w:sz w:val="24"/>
+          <w:szCs w:val="24"/>
+        </w:rPr>
+      </w:pPr>
+      <w:r>
+        <w:rPr>
+          <w:b/>
           <w:sz w:val="24"/>
           <w:szCs w:val="24"/>
         </w:rPr>
@@ -4397,12 +4569,14 @@
       <w:pPr>
         <w:pStyle w:val="Ttulo2"/>
         <w:rPr>
-          <w:sz w:val="24"/>
-          <w:szCs w:val="24"/>
-        </w:rPr>
-      </w:pPr>
-      <w:r>
-        <w:rPr>
+          <w:b/>
+          <w:sz w:val="24"/>
+          <w:szCs w:val="24"/>
+        </w:rPr>
+      </w:pPr>
+      <w:r>
+        <w:rPr>
+          <w:b/>
           <w:sz w:val="24"/>
           <w:szCs w:val="24"/>
         </w:rPr>
@@ -4426,8 +4600,14 @@
     <w:p>
       <w:pPr>
         <w:pStyle w:val="Ttulo2"/>
-      </w:pPr>
-      <w:r>
+        <w:rPr>
+          <w:b/>
+        </w:rPr>
+      </w:pPr>
+      <w:r>
+        <w:rPr>
+          <w:b/>
+        </w:rPr>
         <w:t>6.3 Modernización tecnológica y actualización de plataformas</w:t>
       </w:r>
     </w:p>
@@ -4435,12 +4615,14 @@
       <w:pPr>
         <w:pStyle w:val="Ttulo2"/>
         <w:rPr>
-          <w:sz w:val="24"/>
-          <w:szCs w:val="24"/>
-        </w:rPr>
-      </w:pPr>
-      <w:r>
-        <w:rPr>
+          <w:b/>
+          <w:sz w:val="24"/>
+          <w:szCs w:val="24"/>
+        </w:rPr>
+      </w:pPr>
+      <w:r>
+        <w:rPr>
+          <w:b/>
           <w:sz w:val="24"/>
           <w:szCs w:val="24"/>
         </w:rPr>
@@ -4471,6 +4653,7 @@
       <w:pPr>
         <w:pStyle w:val="Ttulo2"/>
         <w:rPr>
+          <w:b/>
           <w:sz w:val="24"/>
           <w:szCs w:val="24"/>
         </w:rPr>
@@ -4480,6 +4663,7 @@
       </w:r>
       <w:r>
         <w:rPr>
+          <w:b/>
           <w:sz w:val="24"/>
           <w:szCs w:val="24"/>
         </w:rPr>
@@ -4515,12 +4699,14 @@
       <w:pPr>
         <w:pStyle w:val="Ttulo2"/>
         <w:rPr>
-          <w:sz w:val="24"/>
-          <w:szCs w:val="24"/>
-        </w:rPr>
-      </w:pPr>
-      <w:r>
-        <w:rPr>
+          <w:b/>
+          <w:sz w:val="24"/>
+          <w:szCs w:val="24"/>
+        </w:rPr>
+      </w:pPr>
+      <w:r>
+        <w:rPr>
+          <w:b/>
           <w:sz w:val="24"/>
           <w:szCs w:val="24"/>
         </w:rPr>
@@ -4608,6 +4794,34 @@
           <w:rFonts w:eastAsia="Times New Roman"/>
         </w:rPr>
         <w:t xml:space="preserve"> de herramientas que faciliten la integración y el despliegue ordenado de aplicaciones;</w:t>
+      </w:r>
+    </w:p>
+    <w:p>
+      <w:pPr>
+        <w:ind w:left="708"/>
+        <w:rPr>
+          <w:rFonts w:eastAsia="Times New Roman"/>
+        </w:rPr>
+      </w:pPr>
+      <w:r>
+        <w:rPr>
+          <w:rFonts w:eastAsia="Times New Roman"/>
+        </w:rPr>
+        <w:t xml:space="preserve">• </w:t>
+      </w:r>
+      <w:proofErr w:type="gramStart"/>
+      <w:r>
+        <w:rPr>
+          <w:rFonts w:eastAsia="Times New Roman"/>
+        </w:rPr>
+        <w:t>planificación</w:t>
+      </w:r>
+      <w:proofErr w:type="gramEnd"/>
+      <w:r>
+        <w:rPr>
+          <w:rFonts w:eastAsia="Times New Roman"/>
+        </w:rPr>
+        <w:t xml:space="preserve"> de la migración progresiva de aquellos aplicativos que utilicen plataformas obsoletas;</w:t>
       </w:r>
     </w:p>
     <w:p>
@@ -4629,14 +4843,14 @@
         <w:rPr>
           <w:rFonts w:eastAsia="Times New Roman"/>
         </w:rPr>
-        <w:t>planificación</w:t>
+        <w:t>articulación</w:t>
       </w:r>
       <w:proofErr w:type="gramEnd"/>
       <w:r>
         <w:rPr>
           <w:rFonts w:eastAsia="Times New Roman"/>
         </w:rPr>
-        <w:t xml:space="preserve"> de la migración progresiva de aquellos aplicativos que utilicen plataformas obsoletas;</w:t>
+        <w:t xml:space="preserve"> técnica con el área de infraestructura para la optimización de los ambientes de prueba y producción.</w:t>
       </w:r>
     </w:p>
     <w:p>
@@ -4646,6 +4860,196 @@
           <w:rFonts w:eastAsia="Times New Roman"/>
         </w:rPr>
       </w:pPr>
+    </w:p>
+    <w:p>
+      <w:pPr>
+        <w:pStyle w:val="Ttulo2"/>
+        <w:rPr>
+          <w:b/>
+          <w:sz w:val="24"/>
+          <w:szCs w:val="24"/>
+        </w:rPr>
+      </w:pPr>
+      <w:r>
+        <w:rPr>
+          <w:b/>
+          <w:sz w:val="24"/>
+          <w:szCs w:val="24"/>
+        </w:rPr>
+        <w:t>Resultado esperado</w:t>
+      </w:r>
+    </w:p>
+    <w:p>
+      <w:pPr>
+        <w:pStyle w:val="Ttulo2"/>
+        <w:rPr>
+          <w:rFonts w:eastAsia="Times New Roman"/>
+          <w:color w:val="auto"/>
+          <w:sz w:val="22"/>
+          <w:szCs w:val="22"/>
+        </w:rPr>
+      </w:pPr>
+      <w:r>
+        <w:rPr>
+          <w:rFonts w:eastAsia="Times New Roman"/>
+          <w:color w:val="auto"/>
+          <w:sz w:val="22"/>
+          <w:szCs w:val="22"/>
+        </w:rPr>
+        <w:t>Se reducirá el riesgo asociado a tecnologías sin soporte, se simplificará el mantenimiento de los sistemas existentes y se incrementará la capacidad del Departamento para desarrollar nuevas soluciones digitales.</w:t>
+      </w:r>
+    </w:p>
+    <w:p>
+      <w:pPr>
+        <w:pStyle w:val="Ttulo2"/>
+        <w:rPr>
+          <w:rFonts w:eastAsia="Times New Roman"/>
+          <w:color w:val="auto"/>
+          <w:sz w:val="24"/>
+          <w:szCs w:val="24"/>
+        </w:rPr>
+      </w:pPr>
+    </w:p>
+    <w:p>
+      <w:pPr>
+        <w:pStyle w:val="Ttulo2"/>
+        <w:rPr>
+          <w:b/>
+        </w:rPr>
+      </w:pPr>
+      <w:r>
+        <w:rPr>
+          <w:b/>
+        </w:rPr>
+        <w:t>6.4 Fortalecimiento del trabajo colaborativo</w:t>
+      </w:r>
+    </w:p>
+    <w:p>
+      <w:pPr>
+        <w:pStyle w:val="Ttulo2"/>
+        <w:rPr>
+          <w:b/>
+          <w:sz w:val="24"/>
+          <w:szCs w:val="24"/>
+        </w:rPr>
+      </w:pPr>
+      <w:r>
+        <w:rPr>
+          <w:b/>
+          <w:sz w:val="24"/>
+          <w:szCs w:val="24"/>
+        </w:rPr>
+        <w:t>Problema</w:t>
+      </w:r>
+    </w:p>
+    <w:p>
+      <w:pPr>
+        <w:pStyle w:val="Ttulo2"/>
+        <w:rPr>
+          <w:rFonts w:eastAsia="Times New Roman"/>
+          <w:color w:val="auto"/>
+          <w:sz w:val="22"/>
+          <w:szCs w:val="22"/>
+        </w:rPr>
+      </w:pPr>
+      <w:r>
+        <w:rPr>
+          <w:rFonts w:eastAsia="Times New Roman"/>
+          <w:color w:val="auto"/>
+          <w:sz w:val="22"/>
+          <w:szCs w:val="22"/>
+        </w:rPr>
+        <w:t>La coordinación entre equipos distribuidos en distintas dependencias requiere herramientas que faciliten el intercambio permanente de información técnica, la colaboración continua y el acceso compartido al conocimiento institucional.</w:t>
+      </w:r>
+    </w:p>
+    <w:p>
+      <w:pPr>
+        <w:pStyle w:val="Ttulo2"/>
+        <w:rPr>
+          <w:b/>
+          <w:sz w:val="24"/>
+          <w:szCs w:val="24"/>
+        </w:rPr>
+      </w:pPr>
+      <w:r>
+        <w:br/>
+      </w:r>
+      <w:r>
+        <w:rPr>
+          <w:b/>
+          <w:sz w:val="24"/>
+          <w:szCs w:val="24"/>
+        </w:rPr>
+        <w:t>Propuesta</w:t>
+      </w:r>
+    </w:p>
+    <w:p>
+      <w:pPr>
+        <w:pStyle w:val="Ttulo2"/>
+        <w:rPr>
+          <w:rFonts w:eastAsia="Times New Roman"/>
+          <w:color w:val="auto"/>
+          <w:sz w:val="22"/>
+          <w:szCs w:val="22"/>
+        </w:rPr>
+      </w:pPr>
+      <w:r>
+        <w:rPr>
+          <w:rFonts w:eastAsia="Times New Roman"/>
+          <w:color w:val="auto"/>
+          <w:sz w:val="22"/>
+          <w:szCs w:val="22"/>
+        </w:rPr>
+        <w:t>Incorporar plataformas corporativas orientadas al trabajo colaborativo y a la gestión compartida del conocimiento, que permitan centralizar la documentación técnica de los sistemas, facilitar la revisión cruzada de código y mejorar la articulación entre los grupos de desarrollo.</w:t>
+      </w:r>
+    </w:p>
+    <w:p>
+      <w:pPr>
+        <w:pStyle w:val="Ttulo2"/>
+      </w:pPr>
+    </w:p>
+    <w:p>
+      <w:pPr>
+        <w:pStyle w:val="Ttulo2"/>
+        <w:rPr>
+          <w:b/>
+          <w:sz w:val="24"/>
+          <w:szCs w:val="24"/>
+        </w:rPr>
+      </w:pPr>
+      <w:r>
+        <w:rPr>
+          <w:b/>
+          <w:sz w:val="24"/>
+          <w:szCs w:val="24"/>
+        </w:rPr>
+        <w:t>Implementación</w:t>
+      </w:r>
+    </w:p>
+    <w:p>
+      <w:pPr>
+        <w:rPr>
+          <w:rFonts w:eastAsia="Times New Roman"/>
+          <w:sz w:val="24"/>
+          <w:szCs w:val="24"/>
+        </w:rPr>
+      </w:pPr>
+      <w:r>
+        <w:rPr>
+          <w:rFonts w:eastAsia="Times New Roman"/>
+          <w:sz w:val="24"/>
+          <w:szCs w:val="24"/>
+        </w:rPr>
+        <w:t>La implementación comprenderá:</w:t>
+      </w:r>
+    </w:p>
+    <w:p>
+      <w:pPr>
+        <w:ind w:left="708"/>
+        <w:rPr>
+          <w:rFonts w:eastAsia="Times New Roman"/>
+        </w:rPr>
+      </w:pPr>
       <w:r>
         <w:rPr>
           <w:rFonts w:eastAsia="Times New Roman"/>
@@ -4657,14 +5061,14 @@
         <w:rPr>
           <w:rFonts w:eastAsia="Times New Roman"/>
         </w:rPr>
-        <w:t>articulación</w:t>
+        <w:t>incorporación</w:t>
       </w:r>
       <w:proofErr w:type="gramEnd"/>
       <w:r>
         <w:rPr>
           <w:rFonts w:eastAsia="Times New Roman"/>
         </w:rPr>
-        <w:t xml:space="preserve"> técnica con el área de infraestructura para la optimización de los ambientes de prueba y producción.</w:t>
+        <w:t xml:space="preserve"> de plataformas colaborativas para la documentación técnica institucional;</w:t>
       </w:r>
     </w:p>
     <w:p>
@@ -4674,17 +5078,103 @@
           <w:rFonts w:eastAsia="Times New Roman"/>
         </w:rPr>
       </w:pPr>
-    </w:p>
-    <w:p>
-      <w:pPr>
-        <w:pStyle w:val="Ttulo2"/>
-        <w:rPr>
-          <w:sz w:val="24"/>
-          <w:szCs w:val="24"/>
-        </w:rPr>
-      </w:pPr>
-      <w:r>
-        <w:rPr>
+      <w:r>
+        <w:rPr>
+          <w:rFonts w:eastAsia="Times New Roman"/>
+        </w:rPr>
+        <w:t xml:space="preserve">• </w:t>
+      </w:r>
+      <w:proofErr w:type="gramStart"/>
+      <w:r>
+        <w:rPr>
+          <w:rFonts w:eastAsia="Times New Roman"/>
+        </w:rPr>
+        <w:t>implementación</w:t>
+      </w:r>
+      <w:proofErr w:type="gramEnd"/>
+      <w:r>
+        <w:rPr>
+          <w:rFonts w:eastAsia="Times New Roman"/>
+        </w:rPr>
+        <w:t xml:space="preserve"> de herramientas de repositorios de conocimiento y revisión compartida de desarrollos;</w:t>
+      </w:r>
+    </w:p>
+    <w:p>
+      <w:pPr>
+        <w:ind w:left="708"/>
+        <w:rPr>
+          <w:rFonts w:eastAsia="Times New Roman"/>
+        </w:rPr>
+      </w:pPr>
+      <w:r>
+        <w:rPr>
+          <w:rFonts w:eastAsia="Times New Roman"/>
+        </w:rPr>
+        <w:t xml:space="preserve">• </w:t>
+      </w:r>
+      <w:proofErr w:type="gramStart"/>
+      <w:r>
+        <w:rPr>
+          <w:rFonts w:eastAsia="Times New Roman"/>
+        </w:rPr>
+        <w:t>soluciones</w:t>
+      </w:r>
+      <w:proofErr w:type="gramEnd"/>
+      <w:r>
+        <w:rPr>
+          <w:rFonts w:eastAsia="Times New Roman"/>
+        </w:rPr>
+        <w:t xml:space="preserve"> que faciliten la comunicación fluida y la coordinación diaria entre equipos;</w:t>
+      </w:r>
+    </w:p>
+    <w:p>
+      <w:pPr>
+        <w:ind w:left="708"/>
+        <w:rPr>
+          <w:rFonts w:eastAsia="Times New Roman"/>
+        </w:rPr>
+      </w:pPr>
+      <w:r>
+        <w:rPr>
+          <w:rFonts w:eastAsia="Times New Roman"/>
+        </w:rPr>
+        <w:t xml:space="preserve">• </w:t>
+      </w:r>
+      <w:proofErr w:type="gramStart"/>
+      <w:r>
+        <w:rPr>
+          <w:rFonts w:eastAsia="Times New Roman"/>
+        </w:rPr>
+        <w:t>capacitación</w:t>
+      </w:r>
+      <w:proofErr w:type="gramEnd"/>
+      <w:r>
+        <w:rPr>
+          <w:rFonts w:eastAsia="Times New Roman"/>
+        </w:rPr>
+        <w:t xml:space="preserve"> al personal para promover su utilización sistemática.</w:t>
+      </w:r>
+    </w:p>
+    <w:p>
+      <w:pPr>
+        <w:ind w:left="708"/>
+        <w:rPr>
+          <w:rFonts w:eastAsia="Times New Roman"/>
+        </w:rPr>
+      </w:pPr>
+    </w:p>
+    <w:p>
+      <w:pPr>
+        <w:pStyle w:val="Ttulo2"/>
+        <w:rPr>
+          <w:b/>
+          <w:sz w:val="24"/>
+          <w:szCs w:val="24"/>
+        </w:rPr>
+      </w:pPr>
+      <w:r>
+        <w:rPr>
+          <w:b/>
           <w:sz w:val="24"/>
           <w:szCs w:val="24"/>
         </w:rPr>
@@ -4693,53 +5183,50 @@
     </w:p>
     <w:p>
       <w:pPr>
-        <w:pStyle w:val="Ttulo2"/>
-        <w:rPr>
-          <w:rFonts w:eastAsia="Times New Roman"/>
-          <w:color w:val="auto"/>
-          <w:sz w:val="22"/>
-          <w:szCs w:val="22"/>
-        </w:rPr>
-      </w:pPr>
-      <w:r>
-        <w:rPr>
-          <w:rFonts w:eastAsia="Times New Roman"/>
-          <w:color w:val="auto"/>
-          <w:sz w:val="22"/>
-          <w:szCs w:val="22"/>
-        </w:rPr>
-        <w:t>Se reducirá el riesgo asociado a tecnologías sin soporte, se simplificará el mantenimiento de los sistemas existentes y se incrementará la capacidad del Departamento para desarrollar nuevas soluciones digitales.</w:t>
-      </w:r>
-    </w:p>
-    <w:p>
-      <w:pPr>
-        <w:pStyle w:val="Ttulo2"/>
-        <w:rPr>
-          <w:rFonts w:eastAsia="Times New Roman"/>
-          <w:color w:val="auto"/>
-          <w:sz w:val="24"/>
-          <w:szCs w:val="24"/>
-        </w:rPr>
-      </w:pPr>
-    </w:p>
-    <w:p>
-      <w:pPr>
-        <w:pStyle w:val="Ttulo2"/>
-      </w:pPr>
-      <w:r>
-        <w:t>6.4 Fortalecimiento del trabajo colaborativo</w:t>
-      </w:r>
-    </w:p>
-    <w:p>
-      <w:pPr>
-        <w:pStyle w:val="Ttulo2"/>
-        <w:rPr>
-          <w:sz w:val="24"/>
-          <w:szCs w:val="24"/>
-        </w:rPr>
-      </w:pPr>
-      <w:r>
-        <w:rPr>
+        <w:rPr>
+          <w:rFonts w:eastAsia="Times New Roman"/>
+        </w:rPr>
+      </w:pPr>
+      <w:r>
+        <w:rPr>
+          <w:rFonts w:eastAsia="Times New Roman"/>
+        </w:rPr>
+        <w:t>Se fortalecerá la colaboración entre los distintos grupos de trabajo, se facilitará el acceso al conocimiento técnico acumulado, se eliminarán los silos informáticos y se mejorará la cohesión del Departamento.</w:t>
+      </w:r>
+    </w:p>
+    <w:p/>
+    <w:p>
+      <w:pPr>
+        <w:pStyle w:val="Ttulo2"/>
+        <w:rPr>
+          <w:b/>
+        </w:rPr>
+      </w:pPr>
+      <w:r>
+        <w:rPr>
+          <w:b/>
+        </w:rPr>
+        <w:t>6.5 Herramientas de analítica de proyectos y tableros ejecutivos</w:t>
+      </w:r>
+      <w:r>
+        <w:rPr>
+          <w:b/>
+        </w:rPr>
+        <w:tab/>
+      </w:r>
+    </w:p>
+    <w:p>
+      <w:pPr>
+        <w:pStyle w:val="Ttulo2"/>
+        <w:rPr>
+          <w:b/>
+          <w:sz w:val="24"/>
+          <w:szCs w:val="24"/>
+        </w:rPr>
+      </w:pPr>
+      <w:r>
+        <w:rPr>
+          <w:b/>
           <w:sz w:val="24"/>
           <w:szCs w:val="24"/>
         </w:rPr>
@@ -4763,13 +5250,14 @@
           <w:sz w:val="22"/>
           <w:szCs w:val="22"/>
         </w:rPr>
-        <w:t>La coordinación entre equipos distribuidos en distintas dependencias requiere herramientas que faciliten el intercambio permanente de información técnica, la colaboración continua y el acceso compartido al conocimiento institucional.</w:t>
-      </w:r>
-    </w:p>
-    <w:p>
-      <w:pPr>
-        <w:pStyle w:val="Ttulo2"/>
-        <w:rPr>
+        <w:t>La gestión de una cartera compleja de proyectos requiere herramientas de visualización gerencial que permitan medir el desempeño operativo, evaluar la carga de trabajo real y anticipar cuellos de botella en las entregas.</w:t>
+      </w:r>
+    </w:p>
+    <w:p>
+      <w:pPr>
+        <w:pStyle w:val="Ttulo2"/>
+        <w:rPr>
+          <w:b/>
           <w:sz w:val="24"/>
           <w:szCs w:val="24"/>
         </w:rPr>
@@ -4779,280 +5267,7 @@
       </w:r>
       <w:r>
         <w:rPr>
-          <w:sz w:val="24"/>
-          <w:szCs w:val="24"/>
-        </w:rPr>
-        <w:t>Propuesta</w:t>
-      </w:r>
-    </w:p>
-    <w:p>
-      <w:pPr>
-        <w:pStyle w:val="Ttulo2"/>
-        <w:rPr>
-          <w:rFonts w:eastAsia="Times New Roman"/>
-          <w:color w:val="auto"/>
-          <w:sz w:val="22"/>
-          <w:szCs w:val="22"/>
-        </w:rPr>
-      </w:pPr>
-      <w:r>
-        <w:rPr>
-          <w:rFonts w:eastAsia="Times New Roman"/>
-          <w:color w:val="auto"/>
-          <w:sz w:val="22"/>
-          <w:szCs w:val="22"/>
-        </w:rPr>
-        <w:t>Incorporar plataformas corporativas orientadas al trabajo colaborativo y a la gestión compartida del conocimiento, que permitan centralizar la documentación técnica de los sistemas, facilitar la revisión cruzada de código y mejorar la articulación entre los grupos de desarrollo.</w:t>
-      </w:r>
-    </w:p>
-    <w:p>
-      <w:pPr>
-        <w:pStyle w:val="Ttulo2"/>
-      </w:pPr>
-    </w:p>
-    <w:p>
-      <w:pPr>
-        <w:pStyle w:val="Ttulo2"/>
-        <w:rPr>
-          <w:sz w:val="24"/>
-          <w:szCs w:val="24"/>
-        </w:rPr>
-      </w:pPr>
-      <w:r>
-        <w:rPr>
-          <w:sz w:val="24"/>
-          <w:szCs w:val="24"/>
-        </w:rPr>
-        <w:t>Implementación</w:t>
-      </w:r>
-    </w:p>
-    <w:p>
-      <w:pPr>
-        <w:rPr>
-          <w:rFonts w:eastAsia="Times New Roman"/>
-          <w:sz w:val="24"/>
-          <w:szCs w:val="24"/>
-        </w:rPr>
-      </w:pPr>
-      <w:r>
-        <w:rPr>
-          <w:rFonts w:eastAsia="Times New Roman"/>
-          <w:sz w:val="24"/>
-          <w:szCs w:val="24"/>
-        </w:rPr>
-        <w:t>La implementación comprenderá:</w:t>
-      </w:r>
-    </w:p>
-    <w:p>
-      <w:pPr>
-        <w:ind w:left="708"/>
-        <w:rPr>
-          <w:rFonts w:eastAsia="Times New Roman"/>
-        </w:rPr>
-      </w:pPr>
-      <w:r>
-        <w:rPr>
-          <w:rFonts w:eastAsia="Times New Roman"/>
-        </w:rPr>
-        <w:t xml:space="preserve">• </w:t>
-      </w:r>
-      <w:proofErr w:type="gramStart"/>
-      <w:r>
-        <w:rPr>
-          <w:rFonts w:eastAsia="Times New Roman"/>
-        </w:rPr>
-        <w:t>incorporación</w:t>
-      </w:r>
-      <w:proofErr w:type="gramEnd"/>
-      <w:r>
-        <w:rPr>
-          <w:rFonts w:eastAsia="Times New Roman"/>
-        </w:rPr>
-        <w:t xml:space="preserve"> de plataformas colaborativas para la documentación técnica institucional;</w:t>
-      </w:r>
-    </w:p>
-    <w:p>
-      <w:pPr>
-        <w:ind w:left="708"/>
-        <w:rPr>
-          <w:rFonts w:eastAsia="Times New Roman"/>
-        </w:rPr>
-      </w:pPr>
-      <w:r>
-        <w:rPr>
-          <w:rFonts w:eastAsia="Times New Roman"/>
-        </w:rPr>
-        <w:t xml:space="preserve">• </w:t>
-      </w:r>
-      <w:proofErr w:type="gramStart"/>
-      <w:r>
-        <w:rPr>
-          <w:rFonts w:eastAsia="Times New Roman"/>
-        </w:rPr>
-        <w:t>implementación</w:t>
-      </w:r>
-      <w:proofErr w:type="gramEnd"/>
-      <w:r>
-        <w:rPr>
-          <w:rFonts w:eastAsia="Times New Roman"/>
-        </w:rPr>
-        <w:t xml:space="preserve"> de herramientas de repositorios de conocimiento y revisión compartida de desarrollos;</w:t>
-      </w:r>
-    </w:p>
-    <w:p>
-      <w:pPr>
-        <w:ind w:left="708"/>
-        <w:rPr>
-          <w:rFonts w:eastAsia="Times New Roman"/>
-        </w:rPr>
-      </w:pPr>
-      <w:r>
-        <w:rPr>
-          <w:rFonts w:eastAsia="Times New Roman"/>
-        </w:rPr>
-        <w:t xml:space="preserve">• </w:t>
-      </w:r>
-      <w:proofErr w:type="gramStart"/>
-      <w:r>
-        <w:rPr>
-          <w:rFonts w:eastAsia="Times New Roman"/>
-        </w:rPr>
-        <w:t>soluciones</w:t>
-      </w:r>
-      <w:proofErr w:type="gramEnd"/>
-      <w:r>
-        <w:rPr>
-          <w:rFonts w:eastAsia="Times New Roman"/>
-        </w:rPr>
-        <w:t xml:space="preserve"> que faciliten la comunicación fluida y la coordinación diaria entre equipos;</w:t>
-      </w:r>
-    </w:p>
-    <w:p>
-      <w:pPr>
-        <w:ind w:left="708"/>
-        <w:rPr>
-          <w:rFonts w:eastAsia="Times New Roman"/>
-        </w:rPr>
-      </w:pPr>
-      <w:r>
-        <w:rPr>
-          <w:rFonts w:eastAsia="Times New Roman"/>
-        </w:rPr>
-        <w:t xml:space="preserve">• </w:t>
-      </w:r>
-      <w:proofErr w:type="gramStart"/>
-      <w:r>
-        <w:rPr>
-          <w:rFonts w:eastAsia="Times New Roman"/>
-        </w:rPr>
-        <w:t>capacitación</w:t>
-      </w:r>
-      <w:proofErr w:type="gramEnd"/>
-      <w:r>
-        <w:rPr>
-          <w:rFonts w:eastAsia="Times New Roman"/>
-        </w:rPr>
-        <w:t xml:space="preserve"> al personal para promover su utilización sistemática.</w:t>
-      </w:r>
-    </w:p>
-    <w:p>
-      <w:pPr>
-        <w:ind w:left="708"/>
-        <w:rPr>
-          <w:rFonts w:eastAsia="Times New Roman"/>
-        </w:rPr>
-      </w:pPr>
-    </w:p>
-    <w:p>
-      <w:pPr>
-        <w:pStyle w:val="Ttulo2"/>
-        <w:rPr>
-          <w:sz w:val="24"/>
-          <w:szCs w:val="24"/>
-        </w:rPr>
-      </w:pPr>
-      <w:r>
-        <w:rPr>
-          <w:sz w:val="24"/>
-          <w:szCs w:val="24"/>
-        </w:rPr>
-        <w:t>Resultado esperado</w:t>
-      </w:r>
-    </w:p>
-    <w:p>
-      <w:pPr>
-        <w:rPr>
-          <w:rFonts w:eastAsia="Times New Roman"/>
-        </w:rPr>
-      </w:pPr>
-      <w:r>
-        <w:rPr>
-          <w:rFonts w:eastAsia="Times New Roman"/>
-        </w:rPr>
-        <w:t>Se fortalecerá la colaboración entre los distintos grupos de trabajo, se facilitará el acceso al conocimiento técnico acumulado, se eliminarán los silos informáticos y se mejorará la cohesión del Departamento.</w:t>
-      </w:r>
-    </w:p>
-    <w:p/>
-    <w:p>
-      <w:pPr>
-        <w:pStyle w:val="Ttulo2"/>
-      </w:pPr>
-      <w:r>
-        <w:t>6.5 Herramientas de analítica de proyectos y tableros ejecutivos</w:t>
-      </w:r>
-      <w:r>
-        <w:tab/>
-      </w:r>
-    </w:p>
-    <w:p>
-      <w:pPr>
-        <w:pStyle w:val="Ttulo2"/>
-        <w:rPr>
-          <w:sz w:val="24"/>
-          <w:szCs w:val="24"/>
-        </w:rPr>
-      </w:pPr>
-      <w:r>
-        <w:rPr>
-          <w:sz w:val="24"/>
-          <w:szCs w:val="24"/>
-        </w:rPr>
-        <w:t>Problema</w:t>
-      </w:r>
-    </w:p>
-    <w:p>
-      <w:pPr>
-        <w:pStyle w:val="Ttulo2"/>
-        <w:rPr>
-          <w:rFonts w:eastAsia="Times New Roman"/>
-          <w:color w:val="auto"/>
-          <w:sz w:val="22"/>
-          <w:szCs w:val="22"/>
-        </w:rPr>
-      </w:pPr>
-      <w:r>
-        <w:rPr>
-          <w:rFonts w:eastAsia="Times New Roman"/>
-          <w:color w:val="auto"/>
-          <w:sz w:val="22"/>
-          <w:szCs w:val="22"/>
-        </w:rPr>
-        <w:t>La gestión de una cartera compleja de proyectos requiere herramientas de visualización gerencial que permitan medir el desempeño operativo, evaluar la carga de trabajo real y anticipar cuellos de botella en las entregas.</w:t>
-      </w:r>
-    </w:p>
-    <w:p>
-      <w:pPr>
-        <w:pStyle w:val="Ttulo2"/>
-        <w:rPr>
-          <w:sz w:val="24"/>
-          <w:szCs w:val="24"/>
-        </w:rPr>
-      </w:pPr>
-      <w:r>
-        <w:br/>
-      </w:r>
-      <w:r>
-        <w:rPr>
+          <w:b/>
           <w:sz w:val="24"/>
           <w:szCs w:val="24"/>
         </w:rPr>
@@ -5089,12 +5304,14 @@
       <w:pPr>
         <w:pStyle w:val="Ttulo2"/>
         <w:rPr>
-          <w:sz w:val="24"/>
-          <w:szCs w:val="24"/>
-        </w:rPr>
-      </w:pPr>
-      <w:r>
-        <w:rPr>
+          <w:b/>
+          <w:sz w:val="24"/>
+          <w:szCs w:val="24"/>
+        </w:rPr>
+      </w:pPr>
+      <w:r>
+        <w:rPr>
+          <w:b/>
           <w:sz w:val="24"/>
           <w:szCs w:val="24"/>
         </w:rPr>
@@ -5203,21 +5420,24 @@
         <w:ind w:left="708"/>
         <w:rPr>
           <w:rFonts w:eastAsia="Times New Roman"/>
-          <w:sz w:val="24"/>
-          <w:szCs w:val="24"/>
-        </w:rPr>
-      </w:pPr>
-    </w:p>
-    <w:p>
-      <w:pPr>
-        <w:pStyle w:val="Ttulo2"/>
-        <w:rPr>
-          <w:sz w:val="24"/>
-          <w:szCs w:val="24"/>
-        </w:rPr>
-      </w:pPr>
-      <w:r>
-        <w:rPr>
+          <w:b/>
+          <w:sz w:val="24"/>
+          <w:szCs w:val="24"/>
+        </w:rPr>
+      </w:pPr>
+    </w:p>
+    <w:p>
+      <w:pPr>
+        <w:pStyle w:val="Ttulo2"/>
+        <w:rPr>
+          <w:b/>
+          <w:sz w:val="24"/>
+          <w:szCs w:val="24"/>
+        </w:rPr>
+      </w:pPr>
+      <w:r>
+        <w:rPr>
+          <w:b/>
           <w:sz w:val="24"/>
           <w:szCs w:val="24"/>
         </w:rPr>
@@ -5252,8 +5472,14 @@
     <w:p>
       <w:pPr>
         <w:pStyle w:val="Ttulo2"/>
-      </w:pPr>
-      <w:r>
+        <w:rPr>
+          <w:b/>
+        </w:rPr>
+      </w:pPr>
+      <w:r>
+        <w:rPr>
+          <w:b/>
+        </w:rPr>
         <w:t>6.6 Fortalecimiento gradual de la estructura técnica y especialización funcional</w:t>
       </w:r>
     </w:p>
@@ -5261,12 +5487,14 @@
       <w:pPr>
         <w:pStyle w:val="Ttulo2"/>
         <w:rPr>
-          <w:sz w:val="24"/>
-          <w:szCs w:val="24"/>
-        </w:rPr>
-      </w:pPr>
-      <w:r>
-        <w:rPr>
+          <w:b/>
+          <w:sz w:val="24"/>
+          <w:szCs w:val="24"/>
+        </w:rPr>
+      </w:pPr>
+      <w:r>
+        <w:rPr>
+          <w:b/>
           <w:sz w:val="24"/>
           <w:szCs w:val="24"/>
         </w:rPr>
@@ -5297,15 +5525,20 @@
       <w:pPr>
         <w:pStyle w:val="Ttulo2"/>
         <w:rPr>
-          <w:sz w:val="24"/>
-          <w:szCs w:val="24"/>
-        </w:rPr>
-      </w:pPr>
-      <w:r>
+          <w:b/>
+          <w:sz w:val="24"/>
+          <w:szCs w:val="24"/>
+        </w:rPr>
+      </w:pPr>
+      <w:r>
+        <w:rPr>
+          <w:b/>
+        </w:rPr>
         <w:br/>
       </w:r>
       <w:r>
         <w:rPr>
+          <w:b/>
           <w:sz w:val="24"/>
           <w:szCs w:val="24"/>
         </w:rPr>
@@ -5341,12 +5574,14 @@
       <w:pPr>
         <w:pStyle w:val="Ttulo2"/>
         <w:rPr>
-          <w:sz w:val="24"/>
-          <w:szCs w:val="24"/>
-        </w:rPr>
-      </w:pPr>
-      <w:r>
-        <w:rPr>
+          <w:b/>
+          <w:sz w:val="24"/>
+          <w:szCs w:val="24"/>
+        </w:rPr>
+      </w:pPr>
+      <w:r>
+        <w:rPr>
+          <w:b/>
           <w:sz w:val="24"/>
           <w:szCs w:val="24"/>
         </w:rPr>
@@ -5503,12 +5738,14 @@
       <w:pPr>
         <w:pStyle w:val="Ttulo2"/>
         <w:rPr>
-          <w:sz w:val="24"/>
-          <w:szCs w:val="24"/>
-        </w:rPr>
-      </w:pPr>
-      <w:r>
-        <w:rPr>
+          <w:b/>
+          <w:sz w:val="24"/>
+          <w:szCs w:val="24"/>
+        </w:rPr>
+      </w:pPr>
+      <w:r>
+        <w:rPr>
+          <w:b/>
           <w:sz w:val="24"/>
           <w:szCs w:val="24"/>
         </w:rPr>
@@ -5541,12 +5778,14 @@
       <w:pPr>
         <w:pStyle w:val="Ttulo1"/>
         <w:rPr>
+          <w:b/>
           <w:sz w:val="28"/>
           <w:szCs w:val="28"/>
         </w:rPr>
       </w:pPr>
       <w:r>
         <w:rPr>
+          <w:b/>
           <w:sz w:val="28"/>
           <w:szCs w:val="28"/>
         </w:rPr>
@@ -5582,15 +5821,14 @@
         <w:rPr>
           <w:rFonts w:eastAsia="Times New Roman"/>
         </w:rPr>
-        <w:t>Las líneas de acción no requieren una implementación simultánea. La Jefatura determinará el orden de incorporación según la criticidad de los sistemas, las prioridades institucionales, la capacidad operativa y los resultados obtenidos.</w:t>
-      </w:r>
-    </w:p>
-    <w:p>
-      <w:pPr>
-        <w:rPr>
-          <w:rFonts w:eastAsia="Times New Roman"/>
-        </w:rPr>
-      </w:pPr>
+        <w:t>Las líneas de acción no requieren una implementación simultánea. La Jefatura determinará el orden de incorporación según la criticidad de los sistemas, las prioridades institucionales, la capacidad operativa y los resultados obten</w:t>
+      </w:r>
+      <w:r>
+        <w:rPr>
+          <w:rFonts w:eastAsia="Times New Roman"/>
+        </w:rPr>
+        <w:t>idos</w:t>
+      </w:r>
     </w:p>
     <w:p>
       <w:pPr>
@@ -5609,8 +5847,14 @@
     <w:p>
       <w:pPr>
         <w:pStyle w:val="Ttulo2"/>
-      </w:pPr>
-      <w:r>
+        <w:rPr>
+          <w:b/>
+        </w:rPr>
+      </w:pPr>
+      <w:r>
+        <w:rPr>
+          <w:b/>
+        </w:rPr>
         <w:t>7.1 Puesta en marcha</w:t>
       </w:r>
     </w:p>
@@ -5691,8 +5935,14 @@
     <w:p>
       <w:pPr>
         <w:pStyle w:val="Ttulo2"/>
-      </w:pPr>
-      <w:r>
+        <w:rPr>
+          <w:b/>
+        </w:rPr>
+      </w:pPr>
+      <w:r>
+        <w:rPr>
+          <w:b/>
+        </w:rPr>
         <w:t>7.2 Implementación progresiva</w:t>
       </w:r>
     </w:p>
@@ -5706,7 +5956,21 @@
         <w:rPr>
           <w:rFonts w:eastAsia="Times New Roman"/>
         </w:rPr>
-        <w:t>Las medidas se incorporarán de acuerdo con las posibilidades del Departamento, priorizando acciones de impacto organizacional que puedan desarrollarse sin comprometer requerimientos críticos.</w:t>
+        <w:t xml:space="preserve">Las medidas se incorporarán de acuerdo con las posibilidades del Departamento, priorizando </w:t>
+      </w:r>
+      <w:proofErr w:type="gramStart"/>
+      <w:r>
+        <w:rPr>
+          <w:rFonts w:eastAsia="Times New Roman"/>
+        </w:rPr>
+        <w:t>acciones</w:t>
+      </w:r>
+      <w:proofErr w:type="gramEnd"/>
+      <w:r>
+        <w:rPr>
+          <w:rFonts w:eastAsia="Times New Roman"/>
+        </w:rPr>
+        <w:t xml:space="preserve"> de impacto organizacional que puedan desarrollarse sin comprometer requerimientos críticos.</w:t>
       </w:r>
     </w:p>
     <w:p>
@@ -5931,8 +6195,14 @@
     <w:p>
       <w:pPr>
         <w:pStyle w:val="Ttulo2"/>
-      </w:pPr>
-      <w:r>
+        <w:rPr>
+          <w:b/>
+        </w:rPr>
+      </w:pPr>
+      <w:r>
+        <w:rPr>
+          <w:b/>
+        </w:rPr>
         <w:t>7.3 Gestión, seguimiento y ajuste</w:t>
       </w:r>
     </w:p>
@@ -5973,12 +6243,14 @@
       <w:pPr>
         <w:pStyle w:val="Ttulo1"/>
         <w:rPr>
+          <w:b/>
           <w:sz w:val="28"/>
           <w:szCs w:val="28"/>
         </w:rPr>
       </w:pPr>
       <w:r>
         <w:rPr>
+          <w:b/>
           <w:sz w:val="28"/>
           <w:szCs w:val="28"/>
         </w:rPr>
@@ -6039,8 +6311,14 @@
     <w:p>
       <w:pPr>
         <w:pStyle w:val="Ttulo2"/>
-      </w:pPr>
-      <w:r>
+        <w:rPr>
+          <w:b/>
+        </w:rPr>
+      </w:pPr>
+      <w:r>
+        <w:rPr>
+          <w:b/>
+        </w:rPr>
         <w:t>8.1  Revisión periódica de resultados e indicadores de gestión</w:t>
       </w:r>
     </w:p>
@@ -6140,16 +6418,28 @@
     <w:p>
       <w:pPr>
         <w:pStyle w:val="Ttulo2"/>
-      </w:pPr>
-      <w:r>
+        <w:rPr>
+          <w:b/>
+        </w:rPr>
+      </w:pPr>
+      <w:r>
+        <w:rPr>
+          <w:b/>
+        </w:rPr>
         <w:t xml:space="preserve">8.2  Instancias de seguimiento, </w:t>
       </w:r>
       <w:proofErr w:type="spellStart"/>
       <w:r>
+        <w:rPr>
+          <w:b/>
+        </w:rPr>
         <w:t>feedback</w:t>
       </w:r>
       <w:proofErr w:type="spellEnd"/>
       <w:r>
+        <w:rPr>
+          <w:b/>
+        </w:rPr>
         <w:t xml:space="preserve"> interno y clima laboral</w:t>
       </w:r>
     </w:p>
@@ -6250,8 +6540,14 @@
     <w:p>
       <w:pPr>
         <w:pStyle w:val="Ttulo2"/>
-      </w:pPr>
-      <w:r>
+        <w:rPr>
+          <w:b/>
+        </w:rPr>
+      </w:pPr>
+      <w:r>
+        <w:rPr>
+          <w:b/>
+        </w:rPr>
         <w:t>8. 3 3 Ajuste dinámico de la gestión y mejora continua</w:t>
       </w:r>
     </w:p>
@@ -6306,12 +6602,14 @@
       <w:pPr>
         <w:pStyle w:val="Ttulo1"/>
         <w:rPr>
+          <w:b/>
           <w:sz w:val="28"/>
           <w:szCs w:val="28"/>
         </w:rPr>
       </w:pPr>
       <w:r>
         <w:rPr>
+          <w:b/>
           <w:sz w:val="28"/>
           <w:szCs w:val="28"/>
         </w:rPr>

</xml_diff>